<commit_message>
docs(uat): add ISP weekly report, per-ISP export and trend period tests
OVR-004 trend period picker, OVR-005 all-ISP weekly report export,
OVR-006 per-ISP not-blocked export; OVR-001 no longer says 30-day trend.

Co-Authored-By: Claude Opus 5.5 <noreply@anthropic.com>
</commit_message>
<xml_diff>
--- a/docs/uat/UAT_Citadel_v0.1.docx
+++ b/docs/uat/UAT_Citadel_v0.1.docx
@@ -1297,7 +1297,7 @@
       </w:r>
     </w:p>
     <w:bookmarkEnd w:id="14"/>
-    <w:bookmarkStart w:id="78" w:name="_0ab3875af1ad25c8b84f4a9f10b11fc04ddcbd2"/>
+    <w:bookmarkStart w:id="81" w:name="_0ab3875af1ad25c8b84f4a9f10b11fc04ddcbd2"/>
     <w:p>
       <w:pPr>
         <w:pStyle w:val="Heading1"/>
@@ -3386,7 +3386,7 @@
     </w:tbl>
     <w:bookmarkEnd w:id="19"/>
     <w:bookmarkEnd w:id="20"/>
-    <w:bookmarkStart w:id="24" w:name="_overview"/>
+    <w:bookmarkStart w:id="27" w:name="_overview"/>
     <w:p>
       <w:pPr>
         <w:pStyle w:val="Heading2"/>
@@ -3636,7 +3636,7 @@
               <w:jc w:val="left"/>
             </w:pPr>
             <w:r>
-              <w:t xml:space="preserve">The page shows total domains, compliant vs. violation counts, ’Resurfaced’ count, a 30-day trend chart (when there are at least 2 days of data) and one tile per ISP, worst-compliance first.</w:t>
+              <w:t xml:space="preserve">The page shows total domains, compliant vs. violation counts, ’Resurfaced’ count, a compliance trend chart for the selected period (This week by default) and one tile per ISP, worst-compliance first.</w:t>
             </w:r>
           </w:p>
         </w:tc>
@@ -4616,8 +4616,1244 @@
       </w:tr>
     </w:tbl>
     <w:bookmarkEnd w:id="23"/>
+    <w:bookmarkStart w:id="24" w:name="_6684ebad5e60cf072e6eddc1bbad5bda619eead"/>
+    <w:p>
+      <w:pPr>
+        <w:pStyle w:val="Heading3"/>
+      </w:pPr>
+      <w:r>
+        <w:t xml:space="preserve">OVR-004: Change the period of the compliance trend</w:t>
+      </w:r>
+    </w:p>
+    <w:tbl>
+      <w:tblPr>
+        <w:tblStyle w:val="Table"/>
+        <w:tblW w:type="pct" w:w="4750"/>
+        <w:tblLayout w:type="fixed"/>
+        <w:tblLook w:firstRow="1" w:lastRow="0" w:firstColumn="0" w:lastColumn="0" w:noHBand="0" w:noVBand="0" w:val="0020"/>
+      </w:tblPr>
+      <w:tblGrid>
+        <w:gridCol w:w="2119"/>
+        <w:gridCol w:w="7035"/>
+      </w:tblGrid>
+      <w:tr>
+        <w:trPr>
+          <w:cantSplit/>
+          <w:tblHeader w:val="on"/>
+        </w:trPr>
+        <w:tc>
+          <w:tcPr/>
+          <w:p>
+            <w:pPr>
+              <w:pStyle w:val="Compact"/>
+              <w:keepNext/>
+              <w:jc w:val="left"/>
+            </w:pPr>
+            <w:r>
+              <w:rPr>
+                <w:b/>
+                <w:bCs/>
+              </w:rPr>
+              <w:t xml:space="preserve">Module</w:t>
+            </w:r>
+          </w:p>
+        </w:tc>
+        <w:tc>
+          <w:tcPr/>
+          <w:p>
+            <w:pPr>
+              <w:pStyle w:val="Compact"/>
+              <w:keepNext/>
+              <w:jc w:val="left"/>
+            </w:pPr>
+            <w:r>
+              <w:t xml:space="preserve">Overview</w:t>
+            </w:r>
+          </w:p>
+        </w:tc>
+      </w:tr>
+      <w:tr>
+        <w:trPr>
+          <w:cantSplit/>
+        </w:trPr>
+        <w:tc>
+          <w:tcPr/>
+          <w:p>
+            <w:pPr>
+              <w:pStyle w:val="Compact"/>
+              <w:keepNext/>
+              <w:jc w:val="left"/>
+            </w:pPr>
+            <w:r>
+              <w:rPr>
+                <w:b/>
+                <w:bCs/>
+              </w:rPr>
+              <w:t xml:space="preserve">Role</w:t>
+            </w:r>
+          </w:p>
+        </w:tc>
+        <w:tc>
+          <w:tcPr/>
+          <w:p>
+            <w:pPr>
+              <w:pStyle w:val="Compact"/>
+              <w:keepNext/>
+              <w:jc w:val="left"/>
+            </w:pPr>
+            <w:r>
+              <w:t xml:space="preserve">All Roles</w:t>
+            </w:r>
+          </w:p>
+        </w:tc>
+      </w:tr>
+      <w:tr>
+        <w:trPr>
+          <w:cantSplit/>
+        </w:trPr>
+        <w:tc>
+          <w:tcPr/>
+          <w:p>
+            <w:pPr>
+              <w:pStyle w:val="Compact"/>
+              <w:keepNext/>
+              <w:jc w:val="left"/>
+            </w:pPr>
+            <w:r>
+              <w:rPr>
+                <w:b/>
+                <w:bCs/>
+              </w:rPr>
+              <w:t xml:space="preserve">Pre-condition</w:t>
+            </w:r>
+          </w:p>
+        </w:tc>
+        <w:tc>
+          <w:tcPr/>
+          <w:p>
+            <w:pPr>
+              <w:pStyle w:val="Compact"/>
+              <w:keepNext/>
+              <w:jc w:val="left"/>
+            </w:pPr>
+            <w:r>
+              <w:t xml:space="preserve">Scans have been run on at least 2 days this week and last week.</w:t>
+            </w:r>
+          </w:p>
+        </w:tc>
+      </w:tr>
+      <w:tr>
+        <w:trPr>
+          <w:cantSplit/>
+        </w:trPr>
+        <w:tc>
+          <w:tcPr/>
+          <w:p>
+            <w:pPr>
+              <w:pStyle w:val="Compact"/>
+              <w:keepNext/>
+              <w:jc w:val="left"/>
+            </w:pPr>
+            <w:r>
+              <w:rPr>
+                <w:b/>
+                <w:bCs/>
+              </w:rPr>
+              <w:t xml:space="preserve">Test Steps</w:t>
+            </w:r>
+          </w:p>
+        </w:tc>
+        <w:tc>
+          <w:tcPr/>
+          <w:p>
+            <w:pPr>
+              <w:pStyle w:val="Compact"/>
+              <w:keepNext/>
+              <w:jc w:val="left"/>
+            </w:pPr>
+            <w:r>
+              <w:t xml:space="preserve">1. On Overview, open the ’ISP compliance’ tab.</w:t>
+            </w:r>
+            <w:r>
+              <w:br/>
+            </w:r>
+            <w:r>
+              <w:t xml:space="preserve">2. Next to ’Compliance Trend’, click ’Last week’, then ’This week’.</w:t>
+            </w:r>
+            <w:r>
+              <w:br/>
+            </w:r>
+            <w:r>
+              <w:t xml:space="preserve">3. Click ’Custom’ and pick a From and To date.</w:t>
+            </w:r>
+          </w:p>
+        </w:tc>
+      </w:tr>
+      <w:tr>
+        <w:trPr>
+          <w:cantSplit/>
+        </w:trPr>
+        <w:tc>
+          <w:tcPr/>
+          <w:p>
+            <w:pPr>
+              <w:pStyle w:val="Compact"/>
+              <w:keepNext/>
+              <w:jc w:val="left"/>
+            </w:pPr>
+            <w:r>
+              <w:rPr>
+                <w:b/>
+                <w:bCs/>
+              </w:rPr>
+              <w:t xml:space="preserve">Test Data</w:t>
+            </w:r>
+          </w:p>
+        </w:tc>
+        <w:tc>
+          <w:tcPr/>
+          <w:p>
+            <w:pPr>
+              <w:pStyle w:val="Compact"/>
+              <w:keepNext/>
+              <w:jc w:val="left"/>
+            </w:pPr>
+            <w:r>
+              <w:t xml:space="preserve">Custom: any 7-day range with scans</w:t>
+            </w:r>
+          </w:p>
+        </w:tc>
+      </w:tr>
+      <w:tr>
+        <w:trPr>
+          <w:cantSplit/>
+        </w:trPr>
+        <w:tc>
+          <w:tcPr/>
+          <w:p>
+            <w:pPr>
+              <w:pStyle w:val="Compact"/>
+              <w:keepNext/>
+              <w:jc w:val="left"/>
+            </w:pPr>
+            <w:r>
+              <w:rPr>
+                <w:b/>
+                <w:bCs/>
+              </w:rPr>
+              <w:t xml:space="preserve">Expected Result</w:t>
+            </w:r>
+          </w:p>
+        </w:tc>
+        <w:tc>
+          <w:tcPr/>
+          <w:p>
+            <w:pPr>
+              <w:pStyle w:val="Compact"/>
+              <w:keepNext/>
+              <w:jc w:val="left"/>
+            </w:pPr>
+            <w:r>
+              <w:t xml:space="preserve">The trend chart redraws for each period. With Custom, the Export button stays disabled until both dates are picked. If the period has fewer than 2 days of scans, the chart is replaced by ’Not enough scans in this period to draw a trend.’</w:t>
+            </w:r>
+          </w:p>
+        </w:tc>
+      </w:tr>
+      <w:tr>
+        <w:trPr>
+          <w:cantSplit/>
+        </w:trPr>
+        <w:tc>
+          <w:tcPr/>
+          <w:p>
+            <w:pPr>
+              <w:pStyle w:val="Compact"/>
+              <w:keepNext/>
+              <w:jc w:val="left"/>
+            </w:pPr>
+            <w:r>
+              <w:rPr>
+                <w:b/>
+                <w:bCs/>
+              </w:rPr>
+              <w:t xml:space="preserve">Actual Result</w:t>
+            </w:r>
+          </w:p>
+        </w:tc>
+        <w:tc>
+          <w:tcPr/>
+          <w:p>
+            <w:pPr>
+              <w:pStyle w:val="Compact"/>
+              <w:keepNext/>
+              <w:jc w:val="left"/>
+            </w:pPr>
+            <w:r>
+              <w:br/>
+            </w:r>
+            <w:r>
+              <w:br/>
+            </w:r>
+          </w:p>
+        </w:tc>
+      </w:tr>
+      <w:tr>
+        <w:trPr>
+          <w:cantSplit/>
+        </w:trPr>
+        <w:tc>
+          <w:tcPr/>
+          <w:p>
+            <w:pPr>
+              <w:pStyle w:val="Compact"/>
+              <w:keepNext/>
+              <w:jc w:val="left"/>
+            </w:pPr>
+            <w:r>
+              <w:rPr>
+                <w:b/>
+                <w:bCs/>
+              </w:rPr>
+              <w:t xml:space="preserve">Status</w:t>
+            </w:r>
+          </w:p>
+        </w:tc>
+        <w:tc>
+          <w:tcPr/>
+          <w:p>
+            <w:pPr>
+              <w:pStyle w:val="Compact"/>
+              <w:keepNext/>
+              <w:jc w:val="left"/>
+            </w:pPr>
+            <w:sdt>
+              <w:sdtPr>
+                <w14:checkbox>
+                  <w14:checked w14:val="0"/>
+                  <w14:checkedState w14:val="2612" w14:font="MS Gothic"/>
+                  <w14:uncheckedState w14:val="2610" w14:font="MS Gothic"/>
+                </w14:checkbox>
+              </w:sdtPr>
+              <w:sdtContent>
+                <w:r>
+                  <w:rPr>
+                    <w:rFonts w:ascii="MS Gothic" w:eastAsia="MS Gothic" w:hAnsi="MS Gothic"/>
+                  </w:rPr>
+                  <w:t>☐</w:t>
+                </w:r>
+              </w:sdtContent>
+            </w:sdt>
+            <w:r>
+              <w:t xml:space="preserve"> Pass      </w:t>
+            </w:r>
+            <w:sdt>
+              <w:sdtPr>
+                <w14:checkbox>
+                  <w14:checked w14:val="0"/>
+                  <w14:checkedState w14:val="2612" w14:font="MS Gothic"/>
+                  <w14:uncheckedState w14:val="2610" w14:font="MS Gothic"/>
+                </w14:checkbox>
+              </w:sdtPr>
+              <w:sdtContent>
+                <w:r>
+                  <w:rPr>
+                    <w:rFonts w:ascii="MS Gothic" w:eastAsia="MS Gothic" w:hAnsi="MS Gothic"/>
+                  </w:rPr>
+                  <w:t>☐</w:t>
+                </w:r>
+              </w:sdtContent>
+            </w:sdt>
+            <w:r>
+              <w:t xml:space="preserve"> Conditional Pass      </w:t>
+            </w:r>
+            <w:sdt>
+              <w:sdtPr>
+                <w14:checkbox>
+                  <w14:checked w14:val="0"/>
+                  <w14:checkedState w14:val="2612" w14:font="MS Gothic"/>
+                  <w14:uncheckedState w14:val="2610" w14:font="MS Gothic"/>
+                </w14:checkbox>
+              </w:sdtPr>
+              <w:sdtContent>
+                <w:r>
+                  <w:rPr>
+                    <w:rFonts w:ascii="MS Gothic" w:eastAsia="MS Gothic" w:hAnsi="MS Gothic"/>
+                  </w:rPr>
+                  <w:t>☐</w:t>
+                </w:r>
+              </w:sdtContent>
+            </w:sdt>
+            <w:r>
+              <w:t xml:space="preserve"> Fail      </w:t>
+            </w:r>
+          </w:p>
+        </w:tc>
+      </w:tr>
+      <w:tr>
+        <w:trPr>
+          <w:cantSplit/>
+        </w:trPr>
+        <w:tc>
+          <w:tcPr/>
+          <w:p>
+            <w:pPr>
+              <w:pStyle w:val="Compact"/>
+              <w:jc w:val="left"/>
+            </w:pPr>
+            <w:r>
+              <w:rPr>
+                <w:b/>
+                <w:bCs/>
+              </w:rPr>
+              <w:t xml:space="preserve">Remarks</w:t>
+            </w:r>
+          </w:p>
+        </w:tc>
+        <w:tc>
+          <w:tcPr/>
+          <w:p>
+            <w:pPr>
+              <w:pStyle w:val="Compact"/>
+              <w:jc w:val="left"/>
+            </w:pPr>
+            <w:r>
+              <w:br/>
+            </w:r>
+          </w:p>
+        </w:tc>
+      </w:tr>
+    </w:tbl>
     <w:bookmarkEnd w:id="24"/>
-    <w:bookmarkStart w:id="33" w:name="_watchlist"/>
+    <w:bookmarkStart w:id="25" w:name="_8d2e908af4e6762a6145fd2318cc9222740cf20"/>
+    <w:p>
+      <w:pPr>
+        <w:pStyle w:val="Heading3"/>
+      </w:pPr>
+      <w:r>
+        <w:t xml:space="preserve">OVR-005: Export the ISP weekly report (all ISPs)</w:t>
+      </w:r>
+    </w:p>
+    <w:tbl>
+      <w:tblPr>
+        <w:tblStyle w:val="Table"/>
+        <w:tblW w:type="pct" w:w="4750"/>
+        <w:tblLayout w:type="fixed"/>
+        <w:tblLook w:firstRow="1" w:lastRow="0" w:firstColumn="0" w:lastColumn="0" w:noHBand="0" w:noVBand="0" w:val="0020"/>
+      </w:tblPr>
+      <w:tblGrid>
+        <w:gridCol w:w="2119"/>
+        <w:gridCol w:w="7035"/>
+      </w:tblGrid>
+      <w:tr>
+        <w:trPr>
+          <w:cantSplit/>
+          <w:tblHeader w:val="on"/>
+        </w:trPr>
+        <w:tc>
+          <w:tcPr/>
+          <w:p>
+            <w:pPr>
+              <w:pStyle w:val="Compact"/>
+              <w:keepNext/>
+              <w:jc w:val="left"/>
+            </w:pPr>
+            <w:r>
+              <w:rPr>
+                <w:b/>
+                <w:bCs/>
+              </w:rPr>
+              <w:t xml:space="preserve">Module</w:t>
+            </w:r>
+          </w:p>
+        </w:tc>
+        <w:tc>
+          <w:tcPr/>
+          <w:p>
+            <w:pPr>
+              <w:pStyle w:val="Compact"/>
+              <w:keepNext/>
+              <w:jc w:val="left"/>
+            </w:pPr>
+            <w:r>
+              <w:t xml:space="preserve">Overview</w:t>
+            </w:r>
+          </w:p>
+        </w:tc>
+      </w:tr>
+      <w:tr>
+        <w:trPr>
+          <w:cantSplit/>
+        </w:trPr>
+        <w:tc>
+          <w:tcPr/>
+          <w:p>
+            <w:pPr>
+              <w:pStyle w:val="Compact"/>
+              <w:keepNext/>
+              <w:jc w:val="left"/>
+            </w:pPr>
+            <w:r>
+              <w:rPr>
+                <w:b/>
+                <w:bCs/>
+              </w:rPr>
+              <w:t xml:space="preserve">Role</w:t>
+            </w:r>
+          </w:p>
+        </w:tc>
+        <w:tc>
+          <w:tcPr/>
+          <w:p>
+            <w:pPr>
+              <w:pStyle w:val="Compact"/>
+              <w:keepNext/>
+              <w:jc w:val="left"/>
+            </w:pPr>
+            <w:r>
+              <w:t xml:space="preserve">All Roles</w:t>
+            </w:r>
+          </w:p>
+        </w:tc>
+      </w:tr>
+      <w:tr>
+        <w:trPr>
+          <w:cantSplit/>
+        </w:trPr>
+        <w:tc>
+          <w:tcPr/>
+          <w:p>
+            <w:pPr>
+              <w:pStyle w:val="Compact"/>
+              <w:keepNext/>
+              <w:jc w:val="left"/>
+            </w:pPr>
+            <w:r>
+              <w:rPr>
+                <w:b/>
+                <w:bCs/>
+              </w:rPr>
+              <w:t xml:space="preserve">Pre-condition</w:t>
+            </w:r>
+          </w:p>
+        </w:tc>
+        <w:tc>
+          <w:tcPr/>
+          <w:p>
+            <w:pPr>
+              <w:pStyle w:val="Compact"/>
+              <w:keepNext/>
+              <w:jc w:val="left"/>
+            </w:pPr>
+            <w:r>
+              <w:t xml:space="preserve">At least one domain still resolves (is not blocked) on some DNS server in the selected period.</w:t>
+            </w:r>
+          </w:p>
+        </w:tc>
+      </w:tr>
+      <w:tr>
+        <w:trPr>
+          <w:cantSplit/>
+        </w:trPr>
+        <w:tc>
+          <w:tcPr/>
+          <w:p>
+            <w:pPr>
+              <w:pStyle w:val="Compact"/>
+              <w:keepNext/>
+              <w:jc w:val="left"/>
+            </w:pPr>
+            <w:r>
+              <w:rPr>
+                <w:b/>
+                <w:bCs/>
+              </w:rPr>
+              <w:t xml:space="preserve">Test Steps</w:t>
+            </w:r>
+          </w:p>
+        </w:tc>
+        <w:tc>
+          <w:tcPr/>
+          <w:p>
+            <w:pPr>
+              <w:pStyle w:val="Compact"/>
+              <w:keepNext/>
+              <w:jc w:val="left"/>
+            </w:pPr>
+            <w:r>
+              <w:t xml:space="preserve">1. On Overview, open the ’ISP compliance’ tab.</w:t>
+            </w:r>
+            <w:r>
+              <w:br/>
+            </w:r>
+            <w:r>
+              <w:t xml:space="preserve">2. Next to ’Compliance Trend’, pick ’This week’.</w:t>
+            </w:r>
+            <w:r>
+              <w:br/>
+            </w:r>
+            <w:r>
+              <w:t xml:space="preserve">3. Click the Export (download) icon beside the period buttons.</w:t>
+            </w:r>
+            <w:r>
+              <w:br/>
+            </w:r>
+            <w:r>
+              <w:t xml:space="preserve">4. Open the downloaded Excel file.</w:t>
+            </w:r>
+          </w:p>
+        </w:tc>
+      </w:tr>
+      <w:tr>
+        <w:trPr>
+          <w:cantSplit/>
+        </w:trPr>
+        <w:tc>
+          <w:tcPr/>
+          <w:p>
+            <w:pPr>
+              <w:pStyle w:val="Compact"/>
+              <w:keepNext/>
+              <w:jc w:val="left"/>
+            </w:pPr>
+            <w:r>
+              <w:rPr>
+                <w:b/>
+                <w:bCs/>
+              </w:rPr>
+              <w:t xml:space="preserve">Test Data</w:t>
+            </w:r>
+          </w:p>
+        </w:tc>
+        <w:tc>
+          <w:tcPr/>
+          <w:p>
+            <w:pPr>
+              <w:pStyle w:val="Compact"/>
+              <w:keepNext/>
+              <w:jc w:val="left"/>
+            </w:pPr>
+            <w:r>
+              <w:t xml:space="preserve">-</w:t>
+            </w:r>
+          </w:p>
+        </w:tc>
+      </w:tr>
+      <w:tr>
+        <w:trPr>
+          <w:cantSplit/>
+        </w:trPr>
+        <w:tc>
+          <w:tcPr/>
+          <w:p>
+            <w:pPr>
+              <w:pStyle w:val="Compact"/>
+              <w:keepNext/>
+              <w:jc w:val="left"/>
+            </w:pPr>
+            <w:r>
+              <w:rPr>
+                <w:b/>
+                <w:bCs/>
+              </w:rPr>
+              <w:t xml:space="preserve">Expected Result</w:t>
+            </w:r>
+          </w:p>
+        </w:tc>
+        <w:tc>
+          <w:tcPr/>
+          <w:p>
+            <w:pPr>
+              <w:pStyle w:val="Compact"/>
+              <w:keepNext/>
+              <w:jc w:val="left"/>
+            </w:pPr>
+            <w:r>
+              <w:t xml:space="preserve">The file is named isp_weekly_report-YYYY-MM-DD_HHMM.xlsx (Malaysia time). Sheets: ’Summary’ (one row per domain and DNS server that has not blocked it, with Domain, ISP, DNS Server, Scan Date, Notice Date, Due Date, Reference No.), ’DNS Servers’ (name, ISP, address, protocol, enabled), then one sheet per ISP. Every sheet has a header row formatted as an Excel table with filter buttons. A department user’s file only contains their own department’s domains.</w:t>
+            </w:r>
+          </w:p>
+        </w:tc>
+      </w:tr>
+      <w:tr>
+        <w:trPr>
+          <w:cantSplit/>
+        </w:trPr>
+        <w:tc>
+          <w:tcPr/>
+          <w:p>
+            <w:pPr>
+              <w:pStyle w:val="Compact"/>
+              <w:keepNext/>
+              <w:jc w:val="left"/>
+            </w:pPr>
+            <w:r>
+              <w:rPr>
+                <w:b/>
+                <w:bCs/>
+              </w:rPr>
+              <w:t xml:space="preserve">Actual Result</w:t>
+            </w:r>
+          </w:p>
+        </w:tc>
+        <w:tc>
+          <w:tcPr/>
+          <w:p>
+            <w:pPr>
+              <w:pStyle w:val="Compact"/>
+              <w:keepNext/>
+              <w:jc w:val="left"/>
+            </w:pPr>
+            <w:r>
+              <w:br/>
+            </w:r>
+            <w:r>
+              <w:br/>
+            </w:r>
+          </w:p>
+        </w:tc>
+      </w:tr>
+      <w:tr>
+        <w:trPr>
+          <w:cantSplit/>
+        </w:trPr>
+        <w:tc>
+          <w:tcPr/>
+          <w:p>
+            <w:pPr>
+              <w:pStyle w:val="Compact"/>
+              <w:keepNext/>
+              <w:jc w:val="left"/>
+            </w:pPr>
+            <w:r>
+              <w:rPr>
+                <w:b/>
+                <w:bCs/>
+              </w:rPr>
+              <w:t xml:space="preserve">Status</w:t>
+            </w:r>
+          </w:p>
+        </w:tc>
+        <w:tc>
+          <w:tcPr/>
+          <w:p>
+            <w:pPr>
+              <w:pStyle w:val="Compact"/>
+              <w:keepNext/>
+              <w:jc w:val="left"/>
+            </w:pPr>
+            <w:sdt>
+              <w:sdtPr>
+                <w14:checkbox>
+                  <w14:checked w14:val="0"/>
+                  <w14:checkedState w14:val="2612" w14:font="MS Gothic"/>
+                  <w14:uncheckedState w14:val="2610" w14:font="MS Gothic"/>
+                </w14:checkbox>
+              </w:sdtPr>
+              <w:sdtContent>
+                <w:r>
+                  <w:rPr>
+                    <w:rFonts w:ascii="MS Gothic" w:eastAsia="MS Gothic" w:hAnsi="MS Gothic"/>
+                  </w:rPr>
+                  <w:t>☐</w:t>
+                </w:r>
+              </w:sdtContent>
+            </w:sdt>
+            <w:r>
+              <w:t xml:space="preserve"> Pass      </w:t>
+            </w:r>
+            <w:sdt>
+              <w:sdtPr>
+                <w14:checkbox>
+                  <w14:checked w14:val="0"/>
+                  <w14:checkedState w14:val="2612" w14:font="MS Gothic"/>
+                  <w14:uncheckedState w14:val="2610" w14:font="MS Gothic"/>
+                </w14:checkbox>
+              </w:sdtPr>
+              <w:sdtContent>
+                <w:r>
+                  <w:rPr>
+                    <w:rFonts w:ascii="MS Gothic" w:eastAsia="MS Gothic" w:hAnsi="MS Gothic"/>
+                  </w:rPr>
+                  <w:t>☐</w:t>
+                </w:r>
+              </w:sdtContent>
+            </w:sdt>
+            <w:r>
+              <w:t xml:space="preserve"> Conditional Pass      </w:t>
+            </w:r>
+            <w:sdt>
+              <w:sdtPr>
+                <w14:checkbox>
+                  <w14:checked w14:val="0"/>
+                  <w14:checkedState w14:val="2612" w14:font="MS Gothic"/>
+                  <w14:uncheckedState w14:val="2610" w14:font="MS Gothic"/>
+                </w14:checkbox>
+              </w:sdtPr>
+              <w:sdtContent>
+                <w:r>
+                  <w:rPr>
+                    <w:rFonts w:ascii="MS Gothic" w:eastAsia="MS Gothic" w:hAnsi="MS Gothic"/>
+                  </w:rPr>
+                  <w:t>☐</w:t>
+                </w:r>
+              </w:sdtContent>
+            </w:sdt>
+            <w:r>
+              <w:t xml:space="preserve"> Fail      </w:t>
+            </w:r>
+          </w:p>
+        </w:tc>
+      </w:tr>
+      <w:tr>
+        <w:trPr>
+          <w:cantSplit/>
+        </w:trPr>
+        <w:tc>
+          <w:tcPr/>
+          <w:p>
+            <w:pPr>
+              <w:pStyle w:val="Compact"/>
+              <w:jc w:val="left"/>
+            </w:pPr>
+            <w:r>
+              <w:rPr>
+                <w:b/>
+                <w:bCs/>
+              </w:rPr>
+              <w:t xml:space="preserve">Remarks</w:t>
+            </w:r>
+          </w:p>
+        </w:tc>
+        <w:tc>
+          <w:tcPr/>
+          <w:p>
+            <w:pPr>
+              <w:pStyle w:val="Compact"/>
+              <w:jc w:val="left"/>
+            </w:pPr>
+            <w:r>
+              <w:br/>
+            </w:r>
+          </w:p>
+        </w:tc>
+      </w:tr>
+    </w:tbl>
+    <w:bookmarkEnd w:id="25"/>
+    <w:bookmarkStart w:id="26" w:name="_18ceb40bd9ac01570bdc7e9d6a081d008c815cb"/>
+    <w:p>
+      <w:pPr>
+        <w:pStyle w:val="Heading3"/>
+      </w:pPr>
+      <w:r>
+        <w:t xml:space="preserve">OVR-006: Export one ISP’s not-blocked domains</w:t>
+      </w:r>
+    </w:p>
+    <w:tbl>
+      <w:tblPr>
+        <w:tblStyle w:val="Table"/>
+        <w:tblW w:type="pct" w:w="4750"/>
+        <w:tblLayout w:type="fixed"/>
+        <w:tblLook w:firstRow="1" w:lastRow="0" w:firstColumn="0" w:lastColumn="0" w:noHBand="0" w:noVBand="0" w:val="0020"/>
+      </w:tblPr>
+      <w:tblGrid>
+        <w:gridCol w:w="2119"/>
+        <w:gridCol w:w="7035"/>
+      </w:tblGrid>
+      <w:tr>
+        <w:trPr>
+          <w:cantSplit/>
+          <w:tblHeader w:val="on"/>
+        </w:trPr>
+        <w:tc>
+          <w:tcPr/>
+          <w:p>
+            <w:pPr>
+              <w:pStyle w:val="Compact"/>
+              <w:keepNext/>
+              <w:jc w:val="left"/>
+            </w:pPr>
+            <w:r>
+              <w:rPr>
+                <w:b/>
+                <w:bCs/>
+              </w:rPr>
+              <w:t xml:space="preserve">Module</w:t>
+            </w:r>
+          </w:p>
+        </w:tc>
+        <w:tc>
+          <w:tcPr/>
+          <w:p>
+            <w:pPr>
+              <w:pStyle w:val="Compact"/>
+              <w:keepNext/>
+              <w:jc w:val="left"/>
+            </w:pPr>
+            <w:r>
+              <w:t xml:space="preserve">Overview</w:t>
+            </w:r>
+          </w:p>
+        </w:tc>
+      </w:tr>
+      <w:tr>
+        <w:trPr>
+          <w:cantSplit/>
+        </w:trPr>
+        <w:tc>
+          <w:tcPr/>
+          <w:p>
+            <w:pPr>
+              <w:pStyle w:val="Compact"/>
+              <w:keepNext/>
+              <w:jc w:val="left"/>
+            </w:pPr>
+            <w:r>
+              <w:rPr>
+                <w:b/>
+                <w:bCs/>
+              </w:rPr>
+              <w:t xml:space="preserve">Role</w:t>
+            </w:r>
+          </w:p>
+        </w:tc>
+        <w:tc>
+          <w:tcPr/>
+          <w:p>
+            <w:pPr>
+              <w:pStyle w:val="Compact"/>
+              <w:keepNext/>
+              <w:jc w:val="left"/>
+            </w:pPr>
+            <w:r>
+              <w:t xml:space="preserve">All Roles</w:t>
+            </w:r>
+          </w:p>
+        </w:tc>
+      </w:tr>
+      <w:tr>
+        <w:trPr>
+          <w:cantSplit/>
+        </w:trPr>
+        <w:tc>
+          <w:tcPr/>
+          <w:p>
+            <w:pPr>
+              <w:pStyle w:val="Compact"/>
+              <w:keepNext/>
+              <w:jc w:val="left"/>
+            </w:pPr>
+            <w:r>
+              <w:rPr>
+                <w:b/>
+                <w:bCs/>
+              </w:rPr>
+              <w:t xml:space="preserve">Pre-condition</w:t>
+            </w:r>
+          </w:p>
+        </w:tc>
+        <w:tc>
+          <w:tcPr/>
+          <w:p>
+            <w:pPr>
+              <w:pStyle w:val="Compact"/>
+              <w:keepNext/>
+              <w:jc w:val="left"/>
+            </w:pPr>
+            <w:r>
+              <w:t xml:space="preserve">The ISP has at least one domain not blocked in the selected period.</w:t>
+            </w:r>
+          </w:p>
+        </w:tc>
+      </w:tr>
+      <w:tr>
+        <w:trPr>
+          <w:cantSplit/>
+        </w:trPr>
+        <w:tc>
+          <w:tcPr/>
+          <w:p>
+            <w:pPr>
+              <w:pStyle w:val="Compact"/>
+              <w:keepNext/>
+              <w:jc w:val="left"/>
+            </w:pPr>
+            <w:r>
+              <w:rPr>
+                <w:b/>
+                <w:bCs/>
+              </w:rPr>
+              <w:t xml:space="preserve">Test Steps</w:t>
+            </w:r>
+          </w:p>
+        </w:tc>
+        <w:tc>
+          <w:tcPr/>
+          <w:p>
+            <w:pPr>
+              <w:pStyle w:val="Compact"/>
+              <w:keepNext/>
+              <w:jc w:val="left"/>
+            </w:pPr>
+            <w:r>
+              <w:t xml:space="preserve">1. On Overview, click an ISP tile.</w:t>
+            </w:r>
+            <w:r>
+              <w:br/>
+            </w:r>
+            <w:r>
+              <w:t xml:space="preserve">2. On the ISP page, find ’Domains Not Blocked’ and pick a period.</w:t>
+            </w:r>
+            <w:r>
+              <w:br/>
+            </w:r>
+            <w:r>
+              <w:t xml:space="preserve">3. Click ’Export .xlsx’.</w:t>
+            </w:r>
+            <w:r>
+              <w:br/>
+            </w:r>
+            <w:r>
+              <w:t xml:space="preserve">4. Open the downloaded Excel file.</w:t>
+            </w:r>
+          </w:p>
+        </w:tc>
+      </w:tr>
+      <w:tr>
+        <w:trPr>
+          <w:cantSplit/>
+        </w:trPr>
+        <w:tc>
+          <w:tcPr/>
+          <w:p>
+            <w:pPr>
+              <w:pStyle w:val="Compact"/>
+              <w:keepNext/>
+              <w:jc w:val="left"/>
+            </w:pPr>
+            <w:r>
+              <w:rPr>
+                <w:b/>
+                <w:bCs/>
+              </w:rPr>
+              <w:t xml:space="preserve">Test Data</w:t>
+            </w:r>
+          </w:p>
+        </w:tc>
+        <w:tc>
+          <w:tcPr/>
+          <w:p>
+            <w:pPr>
+              <w:pStyle w:val="Compact"/>
+              <w:keepNext/>
+              <w:jc w:val="left"/>
+            </w:pPr>
+            <w:r>
+              <w:t xml:space="preserve">Any ISP</w:t>
+            </w:r>
+          </w:p>
+        </w:tc>
+      </w:tr>
+      <w:tr>
+        <w:trPr>
+          <w:cantSplit/>
+        </w:trPr>
+        <w:tc>
+          <w:tcPr/>
+          <w:p>
+            <w:pPr>
+              <w:pStyle w:val="Compact"/>
+              <w:keepNext/>
+              <w:jc w:val="left"/>
+            </w:pPr>
+            <w:r>
+              <w:rPr>
+                <w:b/>
+                <w:bCs/>
+              </w:rPr>
+              <w:t xml:space="preserve">Expected Result</w:t>
+            </w:r>
+          </w:p>
+        </w:tc>
+        <w:tc>
+          <w:tcPr/>
+          <w:p>
+            <w:pPr>
+              <w:pStyle w:val="Compact"/>
+              <w:keepNext/>
+              <w:jc w:val="left"/>
+            </w:pPr>
+            <w:r>
+              <w:t xml:space="preserve">The file contains one row per domain and DNS server of that ISP only, for the selected period, with DNS server address, resolved IP, scan date, Notice/Due date, reference number, status, days open and screenshot link. It matches the domains listed on the page.</w:t>
+            </w:r>
+          </w:p>
+        </w:tc>
+      </w:tr>
+      <w:tr>
+        <w:trPr>
+          <w:cantSplit/>
+        </w:trPr>
+        <w:tc>
+          <w:tcPr/>
+          <w:p>
+            <w:pPr>
+              <w:pStyle w:val="Compact"/>
+              <w:keepNext/>
+              <w:jc w:val="left"/>
+            </w:pPr>
+            <w:r>
+              <w:rPr>
+                <w:b/>
+                <w:bCs/>
+              </w:rPr>
+              <w:t xml:space="preserve">Actual Result</w:t>
+            </w:r>
+          </w:p>
+        </w:tc>
+        <w:tc>
+          <w:tcPr/>
+          <w:p>
+            <w:pPr>
+              <w:pStyle w:val="Compact"/>
+              <w:keepNext/>
+              <w:jc w:val="left"/>
+            </w:pPr>
+            <w:r>
+              <w:br/>
+            </w:r>
+            <w:r>
+              <w:br/>
+            </w:r>
+          </w:p>
+        </w:tc>
+      </w:tr>
+      <w:tr>
+        <w:trPr>
+          <w:cantSplit/>
+        </w:trPr>
+        <w:tc>
+          <w:tcPr/>
+          <w:p>
+            <w:pPr>
+              <w:pStyle w:val="Compact"/>
+              <w:keepNext/>
+              <w:jc w:val="left"/>
+            </w:pPr>
+            <w:r>
+              <w:rPr>
+                <w:b/>
+                <w:bCs/>
+              </w:rPr>
+              <w:t xml:space="preserve">Status</w:t>
+            </w:r>
+          </w:p>
+        </w:tc>
+        <w:tc>
+          <w:tcPr/>
+          <w:p>
+            <w:pPr>
+              <w:pStyle w:val="Compact"/>
+              <w:keepNext/>
+              <w:jc w:val="left"/>
+            </w:pPr>
+            <w:sdt>
+              <w:sdtPr>
+                <w14:checkbox>
+                  <w14:checked w14:val="0"/>
+                  <w14:checkedState w14:val="2612" w14:font="MS Gothic"/>
+                  <w14:uncheckedState w14:val="2610" w14:font="MS Gothic"/>
+                </w14:checkbox>
+              </w:sdtPr>
+              <w:sdtContent>
+                <w:r>
+                  <w:rPr>
+                    <w:rFonts w:ascii="MS Gothic" w:eastAsia="MS Gothic" w:hAnsi="MS Gothic"/>
+                  </w:rPr>
+                  <w:t>☐</w:t>
+                </w:r>
+              </w:sdtContent>
+            </w:sdt>
+            <w:r>
+              <w:t xml:space="preserve"> Pass      </w:t>
+            </w:r>
+            <w:sdt>
+              <w:sdtPr>
+                <w14:checkbox>
+                  <w14:checked w14:val="0"/>
+                  <w14:checkedState w14:val="2612" w14:font="MS Gothic"/>
+                  <w14:uncheckedState w14:val="2610" w14:font="MS Gothic"/>
+                </w14:checkbox>
+              </w:sdtPr>
+              <w:sdtContent>
+                <w:r>
+                  <w:rPr>
+                    <w:rFonts w:ascii="MS Gothic" w:eastAsia="MS Gothic" w:hAnsi="MS Gothic"/>
+                  </w:rPr>
+                  <w:t>☐</w:t>
+                </w:r>
+              </w:sdtContent>
+            </w:sdt>
+            <w:r>
+              <w:t xml:space="preserve"> Conditional Pass      </w:t>
+            </w:r>
+            <w:sdt>
+              <w:sdtPr>
+                <w14:checkbox>
+                  <w14:checked w14:val="0"/>
+                  <w14:checkedState w14:val="2612" w14:font="MS Gothic"/>
+                  <w14:uncheckedState w14:val="2610" w14:font="MS Gothic"/>
+                </w14:checkbox>
+              </w:sdtPr>
+              <w:sdtContent>
+                <w:r>
+                  <w:rPr>
+                    <w:rFonts w:ascii="MS Gothic" w:eastAsia="MS Gothic" w:hAnsi="MS Gothic"/>
+                  </w:rPr>
+                  <w:t>☐</w:t>
+                </w:r>
+              </w:sdtContent>
+            </w:sdt>
+            <w:r>
+              <w:t xml:space="preserve"> Fail      </w:t>
+            </w:r>
+          </w:p>
+        </w:tc>
+      </w:tr>
+      <w:tr>
+        <w:trPr>
+          <w:cantSplit/>
+        </w:trPr>
+        <w:tc>
+          <w:tcPr/>
+          <w:p>
+            <w:pPr>
+              <w:pStyle w:val="Compact"/>
+              <w:jc w:val="left"/>
+            </w:pPr>
+            <w:r>
+              <w:rPr>
+                <w:b/>
+                <w:bCs/>
+              </w:rPr>
+              <w:t xml:space="preserve">Remarks</w:t>
+            </w:r>
+          </w:p>
+        </w:tc>
+        <w:tc>
+          <w:tcPr/>
+          <w:p>
+            <w:pPr>
+              <w:pStyle w:val="Compact"/>
+              <w:jc w:val="left"/>
+            </w:pPr>
+            <w:r>
+              <w:br/>
+            </w:r>
+          </w:p>
+        </w:tc>
+      </w:tr>
+    </w:tbl>
+    <w:bookmarkEnd w:id="26"/>
+    <w:bookmarkEnd w:id="27"/>
+    <w:bookmarkStart w:id="36" w:name="_watchlist"/>
     <w:p>
       <w:pPr>
         <w:pStyle w:val="Heading2"/>
@@ -4635,7 +5871,7 @@
         <w:t xml:space="preserve">Watchlist</w:t>
       </w:r>
     </w:p>
-    <w:bookmarkStart w:id="25" w:name="_24120e1be3003ee57212f704d548a4959ba77be"/>
+    <w:bookmarkStart w:id="28" w:name="_24120e1be3003ee57212f704d548a4959ba77be"/>
     <w:p>
       <w:pPr>
         <w:pStyle w:val="Heading3"/>
@@ -5072,8 +6308,8 @@
         </w:tc>
       </w:tr>
     </w:tbl>
-    <w:bookmarkEnd w:id="25"/>
-    <w:bookmarkStart w:id="26" w:name="_dbf471ada14b25e39b7684e666a9f302b740dfe"/>
+    <w:bookmarkEnd w:id="28"/>
+    <w:bookmarkStart w:id="29" w:name="_dbf471ada14b25e39b7684e666a9f302b740dfe"/>
     <w:p>
       <w:pPr>
         <w:pStyle w:val="Heading3"/>
@@ -5492,8 +6728,8 @@
         </w:tc>
       </w:tr>
     </w:tbl>
-    <w:bookmarkEnd w:id="26"/>
-    <w:bookmarkStart w:id="27" w:name="_04df32273e17dcacb8d19111cef7e56a725f838"/>
+    <w:bookmarkEnd w:id="29"/>
+    <w:bookmarkStart w:id="30" w:name="_04df32273e17dcacb8d19111cef7e56a725f838"/>
     <w:p>
       <w:pPr>
         <w:pStyle w:val="Heading3"/>
@@ -5906,8 +7142,8 @@
         </w:tc>
       </w:tr>
     </w:tbl>
-    <w:bookmarkEnd w:id="27"/>
-    <w:bookmarkStart w:id="28" w:name="_09e62d6921c5e10f294ed8143704322ae69771e"/>
+    <w:bookmarkEnd w:id="30"/>
+    <w:bookmarkStart w:id="31" w:name="_09e62d6921c5e10f294ed8143704322ae69771e"/>
     <w:p>
       <w:pPr>
         <w:pStyle w:val="Heading3"/>
@@ -6308,8 +7544,8 @@
         </w:tc>
       </w:tr>
     </w:tbl>
-    <w:bookmarkEnd w:id="28"/>
-    <w:bookmarkStart w:id="29" w:name="_de346fbd6a1a97755837a9a8910fa564a424b9b"/>
+    <w:bookmarkEnd w:id="31"/>
+    <w:bookmarkStart w:id="32" w:name="_de346fbd6a1a97755837a9a8910fa564a424b9b"/>
     <w:p>
       <w:pPr>
         <w:pStyle w:val="Heading3"/>
@@ -6716,8 +7952,8 @@
         </w:tc>
       </w:tr>
     </w:tbl>
-    <w:bookmarkEnd w:id="29"/>
-    <w:bookmarkStart w:id="30" w:name="_a693e1cb6de16523e20e5a82805ceef233c6ee5"/>
+    <w:bookmarkEnd w:id="32"/>
+    <w:bookmarkStart w:id="33" w:name="_a693e1cb6de16523e20e5a82805ceef233c6ee5"/>
     <w:p>
       <w:pPr>
         <w:pStyle w:val="Heading3"/>
@@ -7136,8 +8372,8 @@
         </w:tc>
       </w:tr>
     </w:tbl>
-    <w:bookmarkEnd w:id="30"/>
-    <w:bookmarkStart w:id="31" w:name="_86d4e3b9556b15db0fa40bddf888e5046b7c581"/>
+    <w:bookmarkEnd w:id="33"/>
+    <w:bookmarkStart w:id="34" w:name="_86d4e3b9556b15db0fa40bddf888e5046b7c581"/>
     <w:p>
       <w:pPr>
         <w:pStyle w:val="Heading3"/>
@@ -7544,8 +8780,8 @@
         </w:tc>
       </w:tr>
     </w:tbl>
-    <w:bookmarkEnd w:id="31"/>
-    <w:bookmarkStart w:id="32" w:name="_73d3603f2cabe79fe7e88f869046dce292547aa"/>
+    <w:bookmarkEnd w:id="34"/>
+    <w:bookmarkStart w:id="35" w:name="_73d3603f2cabe79fe7e88f869046dce292547aa"/>
     <w:p>
       <w:pPr>
         <w:pStyle w:val="Heading3"/>
@@ -7946,9 +9182,9 @@
         </w:tc>
       </w:tr>
     </w:tbl>
-    <w:bookmarkEnd w:id="32"/>
-    <w:bookmarkEnd w:id="33"/>
-    <w:bookmarkStart w:id="37" w:name="_cases"/>
+    <w:bookmarkEnd w:id="35"/>
+    <w:bookmarkEnd w:id="36"/>
+    <w:bookmarkStart w:id="40" w:name="_cases"/>
     <w:p>
       <w:pPr>
         <w:pStyle w:val="Heading2"/>
@@ -7966,7 +9202,7 @@
         <w:t xml:space="preserve">Cases</w:t>
       </w:r>
     </w:p>
-    <w:bookmarkStart w:id="34" w:name="_655756c384ad1b7485b553dd9cbba5a4b17b88d"/>
+    <w:bookmarkStart w:id="37" w:name="_655756c384ad1b7485b553dd9cbba5a4b17b88d"/>
     <w:p>
       <w:pPr>
         <w:pStyle w:val="Heading3"/>
@@ -8367,8 +9603,8 @@
         </w:tc>
       </w:tr>
     </w:tbl>
-    <w:bookmarkEnd w:id="34"/>
-    <w:bookmarkStart w:id="35" w:name="_ff0714ec73ea8919d6c161a4cc26dbfd3b1960a"/>
+    <w:bookmarkEnd w:id="37"/>
+    <w:bookmarkStart w:id="38" w:name="_ff0714ec73ea8919d6c161a4cc26dbfd3b1960a"/>
     <w:p>
       <w:pPr>
         <w:pStyle w:val="Heading3"/>
@@ -8775,8 +10011,8 @@
         </w:tc>
       </w:tr>
     </w:tbl>
-    <w:bookmarkEnd w:id="35"/>
-    <w:bookmarkStart w:id="36" w:name="_1d3d13bba67bed10758594508ac51054ec1fc9d"/>
+    <w:bookmarkEnd w:id="38"/>
+    <w:bookmarkStart w:id="39" w:name="_1d3d13bba67bed10758594508ac51054ec1fc9d"/>
     <w:p>
       <w:pPr>
         <w:pStyle w:val="Heading3"/>
@@ -9177,9 +10413,9 @@
         </w:tc>
       </w:tr>
     </w:tbl>
-    <w:bookmarkEnd w:id="36"/>
-    <w:bookmarkEnd w:id="37"/>
-    <w:bookmarkStart w:id="44" w:name="_docs"/>
+    <w:bookmarkEnd w:id="39"/>
+    <w:bookmarkEnd w:id="40"/>
+    <w:bookmarkStart w:id="47" w:name="_docs"/>
     <w:p>
       <w:pPr>
         <w:pStyle w:val="Heading2"/>
@@ -9197,7 +10433,7 @@
         <w:t xml:space="preserve">Docs</w:t>
       </w:r>
     </w:p>
-    <w:bookmarkStart w:id="38" w:name="_a0438fe3c5777f641d5a2180d43e4b51f15bd77"/>
+    <w:bookmarkStart w:id="41" w:name="_a0438fe3c5777f641d5a2180d43e4b51f15bd77"/>
     <w:p>
       <w:pPr>
         <w:pStyle w:val="Heading3"/>
@@ -9622,8 +10858,8 @@
         </w:tc>
       </w:tr>
     </w:tbl>
-    <w:bookmarkEnd w:id="38"/>
-    <w:bookmarkStart w:id="39" w:name="_51795b41cddbee97ddf63288f0c6971d5a5a6a5"/>
+    <w:bookmarkEnd w:id="41"/>
+    <w:bookmarkStart w:id="42" w:name="_51795b41cddbee97ddf63288f0c6971d5a5a6a5"/>
     <w:p>
       <w:pPr>
         <w:pStyle w:val="Heading3"/>
@@ -10030,8 +11266,8 @@
         </w:tc>
       </w:tr>
     </w:tbl>
-    <w:bookmarkEnd w:id="39"/>
-    <w:bookmarkStart w:id="40" w:name="_6e120086e2ca22cdace0a5d8175b99a75af4a80"/>
+    <w:bookmarkEnd w:id="42"/>
+    <w:bookmarkStart w:id="43" w:name="_6e120086e2ca22cdace0a5d8175b99a75af4a80"/>
     <w:p>
       <w:pPr>
         <w:pStyle w:val="Heading3"/>
@@ -10438,8 +11674,8 @@
         </w:tc>
       </w:tr>
     </w:tbl>
-    <w:bookmarkEnd w:id="40"/>
-    <w:bookmarkStart w:id="41" w:name="_37b78184b93379060c27a38f95bb3687e141d64"/>
+    <w:bookmarkEnd w:id="43"/>
+    <w:bookmarkStart w:id="44" w:name="_37b78184b93379060c27a38f95bb3687e141d64"/>
     <w:p>
       <w:pPr>
         <w:pStyle w:val="Heading3"/>
@@ -10846,8 +12082,8 @@
         </w:tc>
       </w:tr>
     </w:tbl>
-    <w:bookmarkEnd w:id="41"/>
-    <w:bookmarkStart w:id="42" w:name="_4f91a4fa9aa5eb8b31f40e23bd23473216efa83"/>
+    <w:bookmarkEnd w:id="44"/>
+    <w:bookmarkStart w:id="45" w:name="_4f91a4fa9aa5eb8b31f40e23bd23473216efa83"/>
     <w:p>
       <w:pPr>
         <w:pStyle w:val="Heading3"/>
@@ -11254,8 +12490,8 @@
         </w:tc>
       </w:tr>
     </w:tbl>
-    <w:bookmarkEnd w:id="42"/>
-    <w:bookmarkStart w:id="43" w:name="_e3a1c09c5509d3be7ab6b4835c6408c4171b01e"/>
+    <w:bookmarkEnd w:id="45"/>
+    <w:bookmarkStart w:id="46" w:name="_e3a1c09c5509d3be7ab6b4835c6408c4171b01e"/>
     <w:p>
       <w:pPr>
         <w:pStyle w:val="Heading3"/>
@@ -11656,9 +12892,9 @@
         </w:tc>
       </w:tr>
     </w:tbl>
-    <w:bookmarkEnd w:id="43"/>
-    <w:bookmarkEnd w:id="44"/>
-    <w:bookmarkStart w:id="51" w:name="_c5a152a99d8bdba77d9de822649b39c6b8686d7"/>
+    <w:bookmarkEnd w:id="46"/>
+    <w:bookmarkEnd w:id="47"/>
+    <w:bookmarkStart w:id="54" w:name="_c5a152a99d8bdba77d9de822649b39c6b8686d7"/>
     <w:p>
       <w:pPr>
         <w:pStyle w:val="Heading2"/>
@@ -11676,7 +12912,7 @@
         <w:t xml:space="preserve">Scanning &amp; Results</w:t>
       </w:r>
     </w:p>
-    <w:bookmarkStart w:id="45" w:name="_67968ba38f3be44be6ead82149c02dffddd315f"/>
+    <w:bookmarkStart w:id="48" w:name="_67968ba38f3be44be6ead82149c02dffddd315f"/>
     <w:p>
       <w:pPr>
         <w:pStyle w:val="Heading3"/>
@@ -12083,8 +13319,8 @@
         </w:tc>
       </w:tr>
     </w:tbl>
-    <w:bookmarkEnd w:id="45"/>
-    <w:bookmarkStart w:id="46" w:name="_a78bc942dbe8df956f06bc3bb404c52f4314f5c"/>
+    <w:bookmarkEnd w:id="48"/>
+    <w:bookmarkStart w:id="49" w:name="_a78bc942dbe8df956f06bc3bb404c52f4314f5c"/>
     <w:p>
       <w:pPr>
         <w:pStyle w:val="Heading3"/>
@@ -12497,8 +13733,8 @@
         </w:tc>
       </w:tr>
     </w:tbl>
-    <w:bookmarkEnd w:id="46"/>
-    <w:bookmarkStart w:id="47" w:name="_01dfdd1b36635418f7f619b6a8fe97afa20d1ad"/>
+    <w:bookmarkEnd w:id="49"/>
+    <w:bookmarkStart w:id="50" w:name="_01dfdd1b36635418f7f619b6a8fe97afa20d1ad"/>
     <w:p>
       <w:pPr>
         <w:pStyle w:val="Heading3"/>
@@ -12899,8 +14135,8 @@
         </w:tc>
       </w:tr>
     </w:tbl>
-    <w:bookmarkEnd w:id="47"/>
-    <w:bookmarkStart w:id="48" w:name="_5998aaf04a74db1bdbece620b37fa8f47c1b962"/>
+    <w:bookmarkEnd w:id="50"/>
+    <w:bookmarkStart w:id="51" w:name="_5998aaf04a74db1bdbece620b37fa8f47c1b962"/>
     <w:p>
       <w:pPr>
         <w:pStyle w:val="Heading3"/>
@@ -13313,8 +14549,8 @@
         </w:tc>
       </w:tr>
     </w:tbl>
-    <w:bookmarkEnd w:id="48"/>
-    <w:bookmarkStart w:id="49" w:name="_c72d089a93eacc68f3ad3e1d08f0618baecc1ac"/>
+    <w:bookmarkEnd w:id="51"/>
+    <w:bookmarkStart w:id="52" w:name="_c72d089a93eacc68f3ad3e1d08f0618baecc1ac"/>
     <w:p>
       <w:pPr>
         <w:pStyle w:val="Heading3"/>
@@ -13715,8 +14951,8 @@
         </w:tc>
       </w:tr>
     </w:tbl>
-    <w:bookmarkEnd w:id="49"/>
-    <w:bookmarkStart w:id="50" w:name="_91b6ffbb178238f5991c4a560d7e3dee9497605"/>
+    <w:bookmarkEnd w:id="52"/>
+    <w:bookmarkStart w:id="53" w:name="_91b6ffbb178238f5991c4a560d7e3dee9497605"/>
     <w:p>
       <w:pPr>
         <w:pStyle w:val="Heading3"/>
@@ -14117,9 +15353,9 @@
         </w:tc>
       </w:tr>
     </w:tbl>
-    <w:bookmarkEnd w:id="50"/>
-    <w:bookmarkEnd w:id="51"/>
-    <w:bookmarkStart w:id="56" w:name="_91a444b6a3294a33c007374b53928985fad1328"/>
+    <w:bookmarkEnd w:id="53"/>
+    <w:bookmarkEnd w:id="54"/>
+    <w:bookmarkStart w:id="59" w:name="_91a444b6a3294a33c007374b53928985fad1328"/>
     <w:p>
       <w:pPr>
         <w:pStyle w:val="Heading2"/>
@@ -14137,7 +15373,7 @@
         <w:t xml:space="preserve">Domain Lookup</w:t>
       </w:r>
     </w:p>
-    <w:bookmarkStart w:id="52" w:name="_9221a3e174a8efc2e741af37d638d9a216f2a38"/>
+    <w:bookmarkStart w:id="55" w:name="_9221a3e174a8efc2e741af37d638d9a216f2a38"/>
     <w:p>
       <w:pPr>
         <w:pStyle w:val="Heading3"/>
@@ -14544,8 +15780,8 @@
         </w:tc>
       </w:tr>
     </w:tbl>
-    <w:bookmarkEnd w:id="52"/>
-    <w:bookmarkStart w:id="53" w:name="_30b023606457628c6579bc31a3a5dbf1356f4ae"/>
+    <w:bookmarkEnd w:id="55"/>
+    <w:bookmarkStart w:id="56" w:name="_30b023606457628c6579bc31a3a5dbf1356f4ae"/>
     <w:p>
       <w:pPr>
         <w:pStyle w:val="Heading3"/>
@@ -14940,8 +16176,8 @@
         </w:tc>
       </w:tr>
     </w:tbl>
-    <w:bookmarkEnd w:id="53"/>
-    <w:bookmarkStart w:id="54" w:name="_085ea8d5ad326ad051e6c89f75969ae2bca56b7"/>
+    <w:bookmarkEnd w:id="56"/>
+    <w:bookmarkStart w:id="57" w:name="_085ea8d5ad326ad051e6c89f75969ae2bca56b7"/>
     <w:p>
       <w:pPr>
         <w:pStyle w:val="Heading3"/>
@@ -15336,8 +16572,8 @@
         </w:tc>
       </w:tr>
     </w:tbl>
-    <w:bookmarkEnd w:id="54"/>
-    <w:bookmarkStart w:id="55" w:name="_8305dbd39a6cc6dc38a1739a665c8d2d3636272"/>
+    <w:bookmarkEnd w:id="57"/>
+    <w:bookmarkStart w:id="58" w:name="_8305dbd39a6cc6dc38a1739a665c8d2d3636272"/>
     <w:p>
       <w:pPr>
         <w:pStyle w:val="Heading3"/>
@@ -15732,9 +16968,9 @@
         </w:tc>
       </w:tr>
     </w:tbl>
-    <w:bookmarkEnd w:id="55"/>
-    <w:bookmarkEnd w:id="56"/>
-    <w:bookmarkStart w:id="60" w:name="_notifications"/>
+    <w:bookmarkEnd w:id="58"/>
+    <w:bookmarkEnd w:id="59"/>
+    <w:bookmarkStart w:id="63" w:name="_notifications"/>
     <w:p>
       <w:pPr>
         <w:pStyle w:val="Heading2"/>
@@ -15752,7 +16988,7 @@
         <w:t xml:space="preserve">Notifications</w:t>
       </w:r>
     </w:p>
-    <w:bookmarkStart w:id="57" w:name="_1d9c1c0585af49d82f259a3314f5734f3ad959f"/>
+    <w:bookmarkStart w:id="60" w:name="_1d9c1c0585af49d82f259a3314f5734f3ad959f"/>
     <w:p>
       <w:pPr>
         <w:pStyle w:val="Heading3"/>
@@ -16159,8 +17395,8 @@
         </w:tc>
       </w:tr>
     </w:tbl>
-    <w:bookmarkEnd w:id="57"/>
-    <w:bookmarkStart w:id="58" w:name="_4a08339ec3d0c2f56ea22035d5fed171b89a6c4"/>
+    <w:bookmarkEnd w:id="60"/>
+    <w:bookmarkStart w:id="61" w:name="_4a08339ec3d0c2f56ea22035d5fed171b89a6c4"/>
     <w:p>
       <w:pPr>
         <w:pStyle w:val="Heading3"/>
@@ -16561,8 +17797,8 @@
         </w:tc>
       </w:tr>
     </w:tbl>
-    <w:bookmarkEnd w:id="58"/>
-    <w:bookmarkStart w:id="59" w:name="_042321994b3aa837e06520615e3636bfee87ce2"/>
+    <w:bookmarkEnd w:id="61"/>
+    <w:bookmarkStart w:id="62" w:name="_042321994b3aa837e06520615e3636bfee87ce2"/>
     <w:p>
       <w:pPr>
         <w:pStyle w:val="Heading3"/>
@@ -16963,9 +18199,9 @@
         </w:tc>
       </w:tr>
     </w:tbl>
-    <w:bookmarkEnd w:id="59"/>
-    <w:bookmarkEnd w:id="60"/>
-    <w:bookmarkStart w:id="65" w:name="_38a55961392e3eb2c592e6467148e6c37ea6233"/>
+    <w:bookmarkEnd w:id="62"/>
+    <w:bookmarkEnd w:id="63"/>
+    <w:bookmarkStart w:id="68" w:name="_38a55961392e3eb2c592e6467148e6c37ea6233"/>
     <w:p>
       <w:pPr>
         <w:pStyle w:val="Heading2"/>
@@ -16983,7 +18219,7 @@
         <w:t xml:space="preserve">DNS Servers</w:t>
       </w:r>
     </w:p>
-    <w:bookmarkStart w:id="61" w:name="_713c1a4af1d43e71c924b35bc35cde9227b899d"/>
+    <w:bookmarkStart w:id="64" w:name="_713c1a4af1d43e71c924b35bc35cde9227b899d"/>
     <w:p>
       <w:pPr>
         <w:pStyle w:val="Heading3"/>
@@ -17378,8 +18614,8 @@
         </w:tc>
       </w:tr>
     </w:tbl>
-    <w:bookmarkEnd w:id="61"/>
-    <w:bookmarkStart w:id="62" w:name="_618929a635e14ce1d7fb8fdde65ab6a1a9806d7"/>
+    <w:bookmarkEnd w:id="64"/>
+    <w:bookmarkStart w:id="65" w:name="_618929a635e14ce1d7fb8fdde65ab6a1a9806d7"/>
     <w:p>
       <w:pPr>
         <w:pStyle w:val="Heading3"/>
@@ -17804,8 +19040,8 @@
         </w:tc>
       </w:tr>
     </w:tbl>
-    <w:bookmarkEnd w:id="62"/>
-    <w:bookmarkStart w:id="63" w:name="_890fc929acb54e00593fdc4f7403fa6c0dfdd91"/>
+    <w:bookmarkEnd w:id="65"/>
+    <w:bookmarkStart w:id="66" w:name="_890fc929acb54e00593fdc4f7403fa6c0dfdd91"/>
     <w:p>
       <w:pPr>
         <w:pStyle w:val="Heading3"/>
@@ -18212,8 +19448,8 @@
         </w:tc>
       </w:tr>
     </w:tbl>
-    <w:bookmarkEnd w:id="63"/>
-    <w:bookmarkStart w:id="64" w:name="_85c933c8305500bb78c829164924916a930510e"/>
+    <w:bookmarkEnd w:id="66"/>
+    <w:bookmarkStart w:id="67" w:name="_85c933c8305500bb78c829164924916a930510e"/>
     <w:p>
       <w:pPr>
         <w:pStyle w:val="Heading3"/>
@@ -18614,9 +19850,9 @@
         </w:tc>
       </w:tr>
     </w:tbl>
-    <w:bookmarkEnd w:id="64"/>
-    <w:bookmarkEnd w:id="65"/>
-    <w:bookmarkStart w:id="68" w:name="_047289bb8bc90224dd6cb0601b14266139c4246"/>
+    <w:bookmarkEnd w:id="67"/>
+    <w:bookmarkEnd w:id="68"/>
+    <w:bookmarkStart w:id="71" w:name="_047289bb8bc90224dd6cb0601b14266139c4246"/>
     <w:p>
       <w:pPr>
         <w:pStyle w:val="Heading2"/>
@@ -18634,7 +19870,7 @@
         <w:t xml:space="preserve">Legal Citations</w:t>
       </w:r>
     </w:p>
-    <w:bookmarkStart w:id="66" w:name="_d1a7c9f8f6fb66a6cfe5eba996319e82c95fa01"/>
+    <w:bookmarkStart w:id="69" w:name="_d1a7c9f8f6fb66a6cfe5eba996319e82c95fa01"/>
     <w:p>
       <w:pPr>
         <w:pStyle w:val="Heading3"/>
@@ -19047,8 +20283,8 @@
         </w:tc>
       </w:tr>
     </w:tbl>
-    <w:bookmarkEnd w:id="66"/>
-    <w:bookmarkStart w:id="67" w:name="_f6e46545deb5488e60f1fc86588de22b33d49ba"/>
+    <w:bookmarkEnd w:id="69"/>
+    <w:bookmarkStart w:id="70" w:name="_f6e46545deb5488e60f1fc86588de22b33d49ba"/>
     <w:p>
       <w:pPr>
         <w:pStyle w:val="Heading3"/>
@@ -19455,9 +20691,9 @@
         </w:tc>
       </w:tr>
     </w:tbl>
-    <w:bookmarkEnd w:id="67"/>
-    <w:bookmarkEnd w:id="68"/>
-    <w:bookmarkStart w:id="72" w:name="_8b59d926c59063469a717ebd513cf4c7edda4bc"/>
+    <w:bookmarkEnd w:id="70"/>
+    <w:bookmarkEnd w:id="71"/>
+    <w:bookmarkStart w:id="75" w:name="_8b59d926c59063469a717ebd513cf4c7edda4bc"/>
     <w:p>
       <w:pPr>
         <w:pStyle w:val="Heading2"/>
@@ -19475,7 +20711,7 @@
         <w:t xml:space="preserve">Admin - Users</w:t>
       </w:r>
     </w:p>
-    <w:bookmarkStart w:id="69" w:name="_f478b76430bc19fbda79d80c0261963a911d0d6"/>
+    <w:bookmarkStart w:id="72" w:name="_f478b76430bc19fbda79d80c0261963a911d0d6"/>
     <w:p>
       <w:pPr>
         <w:pStyle w:val="Heading3"/>
@@ -19882,8 +21118,8 @@
         </w:tc>
       </w:tr>
     </w:tbl>
-    <w:bookmarkEnd w:id="69"/>
-    <w:bookmarkStart w:id="70" w:name="_b86130ce8278555c120097ee0d8b59c411b1fbb"/>
+    <w:bookmarkEnd w:id="72"/>
+    <w:bookmarkStart w:id="73" w:name="_b86130ce8278555c120097ee0d8b59c411b1fbb"/>
     <w:p>
       <w:pPr>
         <w:pStyle w:val="Heading3"/>
@@ -20296,8 +21532,8 @@
         </w:tc>
       </w:tr>
     </w:tbl>
-    <w:bookmarkEnd w:id="70"/>
-    <w:bookmarkStart w:id="71" w:name="_3b0b8e14595e575c2e664e46e273de99c6634ec"/>
+    <w:bookmarkEnd w:id="73"/>
+    <w:bookmarkStart w:id="74" w:name="_3b0b8e14595e575c2e664e46e273de99c6634ec"/>
     <w:p>
       <w:pPr>
         <w:pStyle w:val="Heading3"/>
@@ -20692,9 +21928,9 @@
         </w:tc>
       </w:tr>
     </w:tbl>
-    <w:bookmarkEnd w:id="71"/>
-    <w:bookmarkEnd w:id="72"/>
-    <w:bookmarkStart w:id="75" w:name="_23f2e0ec86678c3801f7430e636f1fc67d97b2b"/>
+    <w:bookmarkEnd w:id="74"/>
+    <w:bookmarkEnd w:id="75"/>
+    <w:bookmarkStart w:id="78" w:name="_23f2e0ec86678c3801f7430e636f1fc67d97b2b"/>
     <w:p>
       <w:pPr>
         <w:pStyle w:val="Heading2"/>
@@ -20712,7 +21948,7 @@
         <w:t xml:space="preserve">Admin - Master Data</w:t>
       </w:r>
     </w:p>
-    <w:bookmarkStart w:id="73" w:name="_1a8b4264fc2a36fd068cdfcf0d9798a6a02680e"/>
+    <w:bookmarkStart w:id="76" w:name="_1a8b4264fc2a36fd068cdfcf0d9798a6a02680e"/>
     <w:p>
       <w:pPr>
         <w:pStyle w:val="Heading3"/>
@@ -21119,8 +22355,8 @@
         </w:tc>
       </w:tr>
     </w:tbl>
-    <w:bookmarkEnd w:id="73"/>
-    <w:bookmarkStart w:id="74" w:name="_48a90fde0b4eb66f61492fd114562f4e89fe6a0"/>
+    <w:bookmarkEnd w:id="76"/>
+    <w:bookmarkStart w:id="77" w:name="_48a90fde0b4eb66f61492fd114562f4e89fe6a0"/>
     <w:p>
       <w:pPr>
         <w:pStyle w:val="Heading3"/>
@@ -21521,9 +22757,9 @@
         </w:tc>
       </w:tr>
     </w:tbl>
-    <w:bookmarkEnd w:id="74"/>
-    <w:bookmarkEnd w:id="75"/>
-    <w:bookmarkStart w:id="77" w:name="_f94396428b32702acd425447e6bfbf6b9cc04ec"/>
+    <w:bookmarkEnd w:id="77"/>
+    <w:bookmarkEnd w:id="78"/>
+    <w:bookmarkStart w:id="80" w:name="_f94396428b32702acd425447e6bfbf6b9cc04ec"/>
     <w:p>
       <w:pPr>
         <w:pStyle w:val="Heading2"/>
@@ -21541,7 +22777,7 @@
         <w:t xml:space="preserve">Admin - Configs</w:t>
       </w:r>
     </w:p>
-    <w:bookmarkStart w:id="76" w:name="_7d85f98e9b39868f3963b7a5cdc481d32aa61ce"/>
+    <w:bookmarkStart w:id="79" w:name="_7d85f98e9b39868f3963b7a5cdc481d32aa61ce"/>
     <w:p>
       <w:pPr>
         <w:pStyle w:val="Heading3"/>
@@ -21959,10 +23195,10 @@
         <w:br w:type="page"/>
       </w:r>
     </w:p>
-    <w:bookmarkEnd w:id="76"/>
-    <w:bookmarkEnd w:id="77"/>
-    <w:bookmarkEnd w:id="78"/>
-    <w:bookmarkStart w:id="79" w:name="_dae1f465215414a19944cfedc47ab9b55f579a9"/>
+    <w:bookmarkEnd w:id="79"/>
+    <w:bookmarkEnd w:id="80"/>
+    <w:bookmarkEnd w:id="81"/>
+    <w:bookmarkStart w:id="82" w:name="_dae1f465215414a19944cfedc47ab9b55f579a9"/>
     <w:p>
       <w:pPr>
         <w:pStyle w:val="Heading1"/>
@@ -22901,8 +24137,8 @@
         </w:tc>
       </w:tr>
     </w:tbl>
-    <w:bookmarkEnd w:id="79"/>
-    <w:bookmarkStart w:id="80" w:name="_640d47fc5bb6780d875a58e07077598817a4f46"/>
+    <w:bookmarkEnd w:id="82"/>
+    <w:bookmarkStart w:id="83" w:name="_640d47fc5bb6780d875a58e07077598817a4f46"/>
     <w:p>
       <w:pPr>
         <w:pStyle w:val="Heading1"/>
@@ -23184,7 +24420,7 @@
         </w:tc>
       </w:tr>
     </w:tbl>
-    <w:bookmarkEnd w:id="80"/>
+    <w:bookmarkEnd w:id="83"/>
     <w:sectPr>
       <w:footerReference r:id="rIdFooter1" w:type="default"/>
       <w:pgSz w:h="16838" w:w="11906"/>

</xml_diff>

<commit_message>
docs(uat): add blocking register export test (OVR-007)
Co-Authored-By: Claude Opus 5.5 <noreply@anthropic.com>
</commit_message>
<xml_diff>
--- a/docs/uat/UAT_Citadel_v0.1.docx
+++ b/docs/uat/UAT_Citadel_v0.1.docx
@@ -1297,7 +1297,7 @@
       </w:r>
     </w:p>
     <w:bookmarkEnd w:id="14"/>
-    <w:bookmarkStart w:id="81" w:name="_0ab3875af1ad25c8b84f4a9f10b11fc04ddcbd2"/>
+    <w:bookmarkStart w:id="82" w:name="_0ab3875af1ad25c8b84f4a9f10b11fc04ddcbd2"/>
     <w:p>
       <w:pPr>
         <w:pStyle w:val="Heading1"/>
@@ -3386,7 +3386,7 @@
     </w:tbl>
     <w:bookmarkEnd w:id="19"/>
     <w:bookmarkEnd w:id="20"/>
-    <w:bookmarkStart w:id="27" w:name="_overview"/>
+    <w:bookmarkStart w:id="28" w:name="_overview"/>
     <w:p>
       <w:pPr>
         <w:pStyle w:val="Heading2"/>
@@ -5852,8 +5852,422 @@
       </w:tr>
     </w:tbl>
     <w:bookmarkEnd w:id="26"/>
+    <w:bookmarkStart w:id="27" w:name="_9221e3e41b1d4e3fd238ba1a6b6e1d1fa156c14"/>
+    <w:p>
+      <w:pPr>
+        <w:pStyle w:val="Heading3"/>
+      </w:pPr>
+      <w:r>
+        <w:t xml:space="preserve">OVR-007: Export the blocking register</w:t>
+      </w:r>
+    </w:p>
+    <w:tbl>
+      <w:tblPr>
+        <w:tblStyle w:val="Table"/>
+        <w:tblW w:type="pct" w:w="4750"/>
+        <w:tblLayout w:type="fixed"/>
+        <w:tblLook w:firstRow="1" w:lastRow="0" w:firstColumn="0" w:lastColumn="0" w:noHBand="0" w:noVBand="0" w:val="0020"/>
+      </w:tblPr>
+      <w:tblGrid>
+        <w:gridCol w:w="2119"/>
+        <w:gridCol w:w="7035"/>
+      </w:tblGrid>
+      <w:tr>
+        <w:trPr>
+          <w:cantSplit/>
+          <w:tblHeader w:val="on"/>
+        </w:trPr>
+        <w:tc>
+          <w:tcPr/>
+          <w:p>
+            <w:pPr>
+              <w:pStyle w:val="Compact"/>
+              <w:keepNext/>
+              <w:jc w:val="left"/>
+            </w:pPr>
+            <w:r>
+              <w:rPr>
+                <w:b/>
+                <w:bCs/>
+              </w:rPr>
+              <w:t xml:space="preserve">Module</w:t>
+            </w:r>
+          </w:p>
+        </w:tc>
+        <w:tc>
+          <w:tcPr/>
+          <w:p>
+            <w:pPr>
+              <w:pStyle w:val="Compact"/>
+              <w:keepNext/>
+              <w:jc w:val="left"/>
+            </w:pPr>
+            <w:r>
+              <w:t xml:space="preserve">Overview</w:t>
+            </w:r>
+          </w:p>
+        </w:tc>
+      </w:tr>
+      <w:tr>
+        <w:trPr>
+          <w:cantSplit/>
+        </w:trPr>
+        <w:tc>
+          <w:tcPr/>
+          <w:p>
+            <w:pPr>
+              <w:pStyle w:val="Compact"/>
+              <w:keepNext/>
+              <w:jc w:val="left"/>
+            </w:pPr>
+            <w:r>
+              <w:rPr>
+                <w:b/>
+                <w:bCs/>
+              </w:rPr>
+              <w:t xml:space="preserve">Role</w:t>
+            </w:r>
+          </w:p>
+        </w:tc>
+        <w:tc>
+          <w:tcPr/>
+          <w:p>
+            <w:pPr>
+              <w:pStyle w:val="Compact"/>
+              <w:keepNext/>
+              <w:jc w:val="left"/>
+            </w:pPr>
+            <w:r>
+              <w:t xml:space="preserve">All Roles</w:t>
+            </w:r>
+          </w:p>
+        </w:tc>
+      </w:tr>
+      <w:tr>
+        <w:trPr>
+          <w:cantSplit/>
+        </w:trPr>
+        <w:tc>
+          <w:tcPr/>
+          <w:p>
+            <w:pPr>
+              <w:pStyle w:val="Compact"/>
+              <w:keepNext/>
+              <w:jc w:val="left"/>
+            </w:pPr>
+            <w:r>
+              <w:rPr>
+                <w:b/>
+                <w:bCs/>
+              </w:rPr>
+              <w:t xml:space="preserve">Pre-condition</w:t>
+            </w:r>
+          </w:p>
+        </w:tc>
+        <w:tc>
+          <w:tcPr/>
+          <w:p>
+            <w:pPr>
+              <w:pStyle w:val="Compact"/>
+              <w:keepNext/>
+              <w:jc w:val="left"/>
+            </w:pPr>
+            <w:r>
+              <w:t xml:space="preserve">Blocked domains with a dated Notice letter exist from 2022 onward.</w:t>
+            </w:r>
+          </w:p>
+        </w:tc>
+      </w:tr>
+      <w:tr>
+        <w:trPr>
+          <w:cantSplit/>
+        </w:trPr>
+        <w:tc>
+          <w:tcPr/>
+          <w:p>
+            <w:pPr>
+              <w:pStyle w:val="Compact"/>
+              <w:keepNext/>
+              <w:jc w:val="left"/>
+            </w:pPr>
+            <w:r>
+              <w:rPr>
+                <w:b/>
+                <w:bCs/>
+              </w:rPr>
+              <w:t xml:space="preserve">Test Steps</w:t>
+            </w:r>
+          </w:p>
+        </w:tc>
+        <w:tc>
+          <w:tcPr/>
+          <w:p>
+            <w:pPr>
+              <w:pStyle w:val="Compact"/>
+              <w:keepNext/>
+              <w:jc w:val="left"/>
+            </w:pPr>
+            <w:r>
+              <w:t xml:space="preserve">1. On Overview, open the ’Blocking register’ tab.</w:t>
+            </w:r>
+            <w:r>
+              <w:br/>
+            </w:r>
+            <w:r>
+              <w:t xml:space="preserve">2. Click the Export (download) icon to the right of the A / B / C tabs.</w:t>
+            </w:r>
+            <w:r>
+              <w:br/>
+            </w:r>
+            <w:r>
+              <w:t xml:space="preserve">3. Open the downloaded Excel file.</w:t>
+            </w:r>
+            <w:r>
+              <w:br/>
+            </w:r>
+            <w:r>
+              <w:t xml:space="preserve">4. Compare the totals with the A, B and C views on the page.</w:t>
+            </w:r>
+          </w:p>
+        </w:tc>
+      </w:tr>
+      <w:tr>
+        <w:trPr>
+          <w:cantSplit/>
+        </w:trPr>
+        <w:tc>
+          <w:tcPr/>
+          <w:p>
+            <w:pPr>
+              <w:pStyle w:val="Compact"/>
+              <w:keepNext/>
+              <w:jc w:val="left"/>
+            </w:pPr>
+            <w:r>
+              <w:rPr>
+                <w:b/>
+                <w:bCs/>
+              </w:rPr>
+              <w:t xml:space="preserve">Test Data</w:t>
+            </w:r>
+          </w:p>
+        </w:tc>
+        <w:tc>
+          <w:tcPr/>
+          <w:p>
+            <w:pPr>
+              <w:pStyle w:val="Compact"/>
+              <w:keepNext/>
+              <w:jc w:val="left"/>
+            </w:pPr>
+            <w:r>
+              <w:t xml:space="preserve">-</w:t>
+            </w:r>
+          </w:p>
+        </w:tc>
+      </w:tr>
+      <w:tr>
+        <w:trPr>
+          <w:cantSplit/>
+        </w:trPr>
+        <w:tc>
+          <w:tcPr/>
+          <w:p>
+            <w:pPr>
+              <w:pStyle w:val="Compact"/>
+              <w:keepNext/>
+              <w:jc w:val="left"/>
+            </w:pPr>
+            <w:r>
+              <w:rPr>
+                <w:b/>
+                <w:bCs/>
+              </w:rPr>
+              <w:t xml:space="preserve">Expected Result</w:t>
+            </w:r>
+          </w:p>
+        </w:tc>
+        <w:tc>
+          <w:tcPr/>
+          <w:p>
+            <w:pPr>
+              <w:pStyle w:val="Compact"/>
+              <w:keepNext/>
+              <w:jc w:val="left"/>
+            </w:pPr>
+            <w:r>
+              <w:t xml:space="preserve">The file is named ’Jumlah Sekatan Laman Sesawang DDMMYYYY.xlsx’ and follows the layout of the ’Jumlah Sekatan Laman Sesawang’ workbook. Sheet ’A. Jumlah Sekatan MCMC’ lists MCMC blocks by offence for all years, then one section per year (newest first). Sheet ’B. Jumlah Sekatan Agensi’ does the same for other agencies by agency and offence. Sheet ’C. Perbandingan’ compares MCMC vs Agensi Lain by year, then every agency and offence by year. Each section has Jumlah Sekatan, Peratusan and a Jumlah Keseluruhan row, and the title shows today’s date (’Setakat ...’). The C sheet’s totals match the page’s C · Comparison view. A department user’s file only counts their own department’s blocks.</w:t>
+            </w:r>
+          </w:p>
+        </w:tc>
+      </w:tr>
+      <w:tr>
+        <w:trPr>
+          <w:cantSplit/>
+        </w:trPr>
+        <w:tc>
+          <w:tcPr/>
+          <w:p>
+            <w:pPr>
+              <w:pStyle w:val="Compact"/>
+              <w:keepNext/>
+              <w:jc w:val="left"/>
+            </w:pPr>
+            <w:r>
+              <w:rPr>
+                <w:b/>
+                <w:bCs/>
+              </w:rPr>
+              <w:t xml:space="preserve">Actual Result</w:t>
+            </w:r>
+          </w:p>
+        </w:tc>
+        <w:tc>
+          <w:tcPr/>
+          <w:p>
+            <w:pPr>
+              <w:pStyle w:val="Compact"/>
+              <w:keepNext/>
+              <w:jc w:val="left"/>
+            </w:pPr>
+            <w:r>
+              <w:br/>
+            </w:r>
+            <w:r>
+              <w:br/>
+            </w:r>
+          </w:p>
+        </w:tc>
+      </w:tr>
+      <w:tr>
+        <w:trPr>
+          <w:cantSplit/>
+        </w:trPr>
+        <w:tc>
+          <w:tcPr/>
+          <w:p>
+            <w:pPr>
+              <w:pStyle w:val="Compact"/>
+              <w:keepNext/>
+              <w:jc w:val="left"/>
+            </w:pPr>
+            <w:r>
+              <w:rPr>
+                <w:b/>
+                <w:bCs/>
+              </w:rPr>
+              <w:t xml:space="preserve">Status</w:t>
+            </w:r>
+          </w:p>
+        </w:tc>
+        <w:tc>
+          <w:tcPr/>
+          <w:p>
+            <w:pPr>
+              <w:pStyle w:val="Compact"/>
+              <w:keepNext/>
+              <w:jc w:val="left"/>
+            </w:pPr>
+            <w:sdt>
+              <w:sdtPr>
+                <w14:checkbox>
+                  <w14:checked w14:val="0"/>
+                  <w14:checkedState w14:val="2612" w14:font="MS Gothic"/>
+                  <w14:uncheckedState w14:val="2610" w14:font="MS Gothic"/>
+                </w14:checkbox>
+              </w:sdtPr>
+              <w:sdtContent>
+                <w:r>
+                  <w:rPr>
+                    <w:rFonts w:ascii="MS Gothic" w:eastAsia="MS Gothic" w:hAnsi="MS Gothic"/>
+                  </w:rPr>
+                  <w:t>☐</w:t>
+                </w:r>
+              </w:sdtContent>
+            </w:sdt>
+            <w:r>
+              <w:t xml:space="preserve"> Pass      </w:t>
+            </w:r>
+            <w:sdt>
+              <w:sdtPr>
+                <w14:checkbox>
+                  <w14:checked w14:val="0"/>
+                  <w14:checkedState w14:val="2612" w14:font="MS Gothic"/>
+                  <w14:uncheckedState w14:val="2610" w14:font="MS Gothic"/>
+                </w14:checkbox>
+              </w:sdtPr>
+              <w:sdtContent>
+                <w:r>
+                  <w:rPr>
+                    <w:rFonts w:ascii="MS Gothic" w:eastAsia="MS Gothic" w:hAnsi="MS Gothic"/>
+                  </w:rPr>
+                  <w:t>☐</w:t>
+                </w:r>
+              </w:sdtContent>
+            </w:sdt>
+            <w:r>
+              <w:t xml:space="preserve"> Conditional Pass      </w:t>
+            </w:r>
+            <w:sdt>
+              <w:sdtPr>
+                <w14:checkbox>
+                  <w14:checked w14:val="0"/>
+                  <w14:checkedState w14:val="2612" w14:font="MS Gothic"/>
+                  <w14:uncheckedState w14:val="2610" w14:font="MS Gothic"/>
+                </w14:checkbox>
+              </w:sdtPr>
+              <w:sdtContent>
+                <w:r>
+                  <w:rPr>
+                    <w:rFonts w:ascii="MS Gothic" w:eastAsia="MS Gothic" w:hAnsi="MS Gothic"/>
+                  </w:rPr>
+                  <w:t>☐</w:t>
+                </w:r>
+              </w:sdtContent>
+            </w:sdt>
+            <w:r>
+              <w:t xml:space="preserve"> Fail      </w:t>
+            </w:r>
+          </w:p>
+        </w:tc>
+      </w:tr>
+      <w:tr>
+        <w:trPr>
+          <w:cantSplit/>
+        </w:trPr>
+        <w:tc>
+          <w:tcPr/>
+          <w:p>
+            <w:pPr>
+              <w:pStyle w:val="Compact"/>
+              <w:jc w:val="left"/>
+            </w:pPr>
+            <w:r>
+              <w:rPr>
+                <w:b/>
+                <w:bCs/>
+              </w:rPr>
+              <w:t xml:space="preserve">Remarks</w:t>
+            </w:r>
+          </w:p>
+        </w:tc>
+        <w:tc>
+          <w:tcPr/>
+          <w:p>
+            <w:pPr>
+              <w:pStyle w:val="Compact"/>
+              <w:jc w:val="left"/>
+            </w:pPr>
+            <w:r>
+              <w:br/>
+            </w:r>
+          </w:p>
+        </w:tc>
+      </w:tr>
+    </w:tbl>
     <w:bookmarkEnd w:id="27"/>
-    <w:bookmarkStart w:id="36" w:name="_watchlist"/>
+    <w:bookmarkEnd w:id="28"/>
+    <w:bookmarkStart w:id="37" w:name="_watchlist"/>
     <w:p>
       <w:pPr>
         <w:pStyle w:val="Heading2"/>
@@ -5871,7 +6285,7 @@
         <w:t xml:space="preserve">Watchlist</w:t>
       </w:r>
     </w:p>
-    <w:bookmarkStart w:id="28" w:name="_24120e1be3003ee57212f704d548a4959ba77be"/>
+    <w:bookmarkStart w:id="29" w:name="_24120e1be3003ee57212f704d548a4959ba77be"/>
     <w:p>
       <w:pPr>
         <w:pStyle w:val="Heading3"/>
@@ -6308,8 +6722,8 @@
         </w:tc>
       </w:tr>
     </w:tbl>
-    <w:bookmarkEnd w:id="28"/>
-    <w:bookmarkStart w:id="29" w:name="_dbf471ada14b25e39b7684e666a9f302b740dfe"/>
+    <w:bookmarkEnd w:id="29"/>
+    <w:bookmarkStart w:id="30" w:name="_dbf471ada14b25e39b7684e666a9f302b740dfe"/>
     <w:p>
       <w:pPr>
         <w:pStyle w:val="Heading3"/>
@@ -6728,8 +7142,8 @@
         </w:tc>
       </w:tr>
     </w:tbl>
-    <w:bookmarkEnd w:id="29"/>
-    <w:bookmarkStart w:id="30" w:name="_04df32273e17dcacb8d19111cef7e56a725f838"/>
+    <w:bookmarkEnd w:id="30"/>
+    <w:bookmarkStart w:id="31" w:name="_04df32273e17dcacb8d19111cef7e56a725f838"/>
     <w:p>
       <w:pPr>
         <w:pStyle w:val="Heading3"/>
@@ -7142,8 +7556,8 @@
         </w:tc>
       </w:tr>
     </w:tbl>
-    <w:bookmarkEnd w:id="30"/>
-    <w:bookmarkStart w:id="31" w:name="_09e62d6921c5e10f294ed8143704322ae69771e"/>
+    <w:bookmarkEnd w:id="31"/>
+    <w:bookmarkStart w:id="32" w:name="_09e62d6921c5e10f294ed8143704322ae69771e"/>
     <w:p>
       <w:pPr>
         <w:pStyle w:val="Heading3"/>
@@ -7544,8 +7958,8 @@
         </w:tc>
       </w:tr>
     </w:tbl>
-    <w:bookmarkEnd w:id="31"/>
-    <w:bookmarkStart w:id="32" w:name="_de346fbd6a1a97755837a9a8910fa564a424b9b"/>
+    <w:bookmarkEnd w:id="32"/>
+    <w:bookmarkStart w:id="33" w:name="_de346fbd6a1a97755837a9a8910fa564a424b9b"/>
     <w:p>
       <w:pPr>
         <w:pStyle w:val="Heading3"/>
@@ -7952,8 +8366,8 @@
         </w:tc>
       </w:tr>
     </w:tbl>
-    <w:bookmarkEnd w:id="32"/>
-    <w:bookmarkStart w:id="33" w:name="_a693e1cb6de16523e20e5a82805ceef233c6ee5"/>
+    <w:bookmarkEnd w:id="33"/>
+    <w:bookmarkStart w:id="34" w:name="_a693e1cb6de16523e20e5a82805ceef233c6ee5"/>
     <w:p>
       <w:pPr>
         <w:pStyle w:val="Heading3"/>
@@ -8372,8 +8786,8 @@
         </w:tc>
       </w:tr>
     </w:tbl>
-    <w:bookmarkEnd w:id="33"/>
-    <w:bookmarkStart w:id="34" w:name="_86d4e3b9556b15db0fa40bddf888e5046b7c581"/>
+    <w:bookmarkEnd w:id="34"/>
+    <w:bookmarkStart w:id="35" w:name="_86d4e3b9556b15db0fa40bddf888e5046b7c581"/>
     <w:p>
       <w:pPr>
         <w:pStyle w:val="Heading3"/>
@@ -8780,8 +9194,8 @@
         </w:tc>
       </w:tr>
     </w:tbl>
-    <w:bookmarkEnd w:id="34"/>
-    <w:bookmarkStart w:id="35" w:name="_73d3603f2cabe79fe7e88f869046dce292547aa"/>
+    <w:bookmarkEnd w:id="35"/>
+    <w:bookmarkStart w:id="36" w:name="_73d3603f2cabe79fe7e88f869046dce292547aa"/>
     <w:p>
       <w:pPr>
         <w:pStyle w:val="Heading3"/>
@@ -9182,9 +9596,9 @@
         </w:tc>
       </w:tr>
     </w:tbl>
-    <w:bookmarkEnd w:id="35"/>
     <w:bookmarkEnd w:id="36"/>
-    <w:bookmarkStart w:id="40" w:name="_cases"/>
+    <w:bookmarkEnd w:id="37"/>
+    <w:bookmarkStart w:id="41" w:name="_cases"/>
     <w:p>
       <w:pPr>
         <w:pStyle w:val="Heading2"/>
@@ -9202,7 +9616,7 @@
         <w:t xml:space="preserve">Cases</w:t>
       </w:r>
     </w:p>
-    <w:bookmarkStart w:id="37" w:name="_655756c384ad1b7485b553dd9cbba5a4b17b88d"/>
+    <w:bookmarkStart w:id="38" w:name="_655756c384ad1b7485b553dd9cbba5a4b17b88d"/>
     <w:p>
       <w:pPr>
         <w:pStyle w:val="Heading3"/>
@@ -9603,8 +10017,8 @@
         </w:tc>
       </w:tr>
     </w:tbl>
-    <w:bookmarkEnd w:id="37"/>
-    <w:bookmarkStart w:id="38" w:name="_ff0714ec73ea8919d6c161a4cc26dbfd3b1960a"/>
+    <w:bookmarkEnd w:id="38"/>
+    <w:bookmarkStart w:id="39" w:name="_ff0714ec73ea8919d6c161a4cc26dbfd3b1960a"/>
     <w:p>
       <w:pPr>
         <w:pStyle w:val="Heading3"/>
@@ -10011,8 +10425,8 @@
         </w:tc>
       </w:tr>
     </w:tbl>
-    <w:bookmarkEnd w:id="38"/>
-    <w:bookmarkStart w:id="39" w:name="_1d3d13bba67bed10758594508ac51054ec1fc9d"/>
+    <w:bookmarkEnd w:id="39"/>
+    <w:bookmarkStart w:id="40" w:name="_1d3d13bba67bed10758594508ac51054ec1fc9d"/>
     <w:p>
       <w:pPr>
         <w:pStyle w:val="Heading3"/>
@@ -10413,9 +10827,9 @@
         </w:tc>
       </w:tr>
     </w:tbl>
-    <w:bookmarkEnd w:id="39"/>
     <w:bookmarkEnd w:id="40"/>
-    <w:bookmarkStart w:id="47" w:name="_docs"/>
+    <w:bookmarkEnd w:id="41"/>
+    <w:bookmarkStart w:id="48" w:name="_docs"/>
     <w:p>
       <w:pPr>
         <w:pStyle w:val="Heading2"/>
@@ -10433,7 +10847,7 @@
         <w:t xml:space="preserve">Docs</w:t>
       </w:r>
     </w:p>
-    <w:bookmarkStart w:id="41" w:name="_a0438fe3c5777f641d5a2180d43e4b51f15bd77"/>
+    <w:bookmarkStart w:id="42" w:name="_a0438fe3c5777f641d5a2180d43e4b51f15bd77"/>
     <w:p>
       <w:pPr>
         <w:pStyle w:val="Heading3"/>
@@ -10858,8 +11272,8 @@
         </w:tc>
       </w:tr>
     </w:tbl>
-    <w:bookmarkEnd w:id="41"/>
-    <w:bookmarkStart w:id="42" w:name="_51795b41cddbee97ddf63288f0c6971d5a5a6a5"/>
+    <w:bookmarkEnd w:id="42"/>
+    <w:bookmarkStart w:id="43" w:name="_51795b41cddbee97ddf63288f0c6971d5a5a6a5"/>
     <w:p>
       <w:pPr>
         <w:pStyle w:val="Heading3"/>
@@ -11266,8 +11680,8 @@
         </w:tc>
       </w:tr>
     </w:tbl>
-    <w:bookmarkEnd w:id="42"/>
-    <w:bookmarkStart w:id="43" w:name="_6e120086e2ca22cdace0a5d8175b99a75af4a80"/>
+    <w:bookmarkEnd w:id="43"/>
+    <w:bookmarkStart w:id="44" w:name="_6e120086e2ca22cdace0a5d8175b99a75af4a80"/>
     <w:p>
       <w:pPr>
         <w:pStyle w:val="Heading3"/>
@@ -11674,8 +12088,8 @@
         </w:tc>
       </w:tr>
     </w:tbl>
-    <w:bookmarkEnd w:id="43"/>
-    <w:bookmarkStart w:id="44" w:name="_37b78184b93379060c27a38f95bb3687e141d64"/>
+    <w:bookmarkEnd w:id="44"/>
+    <w:bookmarkStart w:id="45" w:name="_37b78184b93379060c27a38f95bb3687e141d64"/>
     <w:p>
       <w:pPr>
         <w:pStyle w:val="Heading3"/>
@@ -12082,8 +12496,8 @@
         </w:tc>
       </w:tr>
     </w:tbl>
-    <w:bookmarkEnd w:id="44"/>
-    <w:bookmarkStart w:id="45" w:name="_4f91a4fa9aa5eb8b31f40e23bd23473216efa83"/>
+    <w:bookmarkEnd w:id="45"/>
+    <w:bookmarkStart w:id="46" w:name="_4f91a4fa9aa5eb8b31f40e23bd23473216efa83"/>
     <w:p>
       <w:pPr>
         <w:pStyle w:val="Heading3"/>
@@ -12490,8 +12904,8 @@
         </w:tc>
       </w:tr>
     </w:tbl>
-    <w:bookmarkEnd w:id="45"/>
-    <w:bookmarkStart w:id="46" w:name="_e3a1c09c5509d3be7ab6b4835c6408c4171b01e"/>
+    <w:bookmarkEnd w:id="46"/>
+    <w:bookmarkStart w:id="47" w:name="_e3a1c09c5509d3be7ab6b4835c6408c4171b01e"/>
     <w:p>
       <w:pPr>
         <w:pStyle w:val="Heading3"/>
@@ -12892,9 +13306,9 @@
         </w:tc>
       </w:tr>
     </w:tbl>
-    <w:bookmarkEnd w:id="46"/>
     <w:bookmarkEnd w:id="47"/>
-    <w:bookmarkStart w:id="54" w:name="_c5a152a99d8bdba77d9de822649b39c6b8686d7"/>
+    <w:bookmarkEnd w:id="48"/>
+    <w:bookmarkStart w:id="55" w:name="_c5a152a99d8bdba77d9de822649b39c6b8686d7"/>
     <w:p>
       <w:pPr>
         <w:pStyle w:val="Heading2"/>
@@ -12912,7 +13326,7 @@
         <w:t xml:space="preserve">Scanning &amp; Results</w:t>
       </w:r>
     </w:p>
-    <w:bookmarkStart w:id="48" w:name="_67968ba38f3be44be6ead82149c02dffddd315f"/>
+    <w:bookmarkStart w:id="49" w:name="_67968ba38f3be44be6ead82149c02dffddd315f"/>
     <w:p>
       <w:pPr>
         <w:pStyle w:val="Heading3"/>
@@ -13319,8 +13733,8 @@
         </w:tc>
       </w:tr>
     </w:tbl>
-    <w:bookmarkEnd w:id="48"/>
-    <w:bookmarkStart w:id="49" w:name="_a78bc942dbe8df956f06bc3bb404c52f4314f5c"/>
+    <w:bookmarkEnd w:id="49"/>
+    <w:bookmarkStart w:id="50" w:name="_a78bc942dbe8df956f06bc3bb404c52f4314f5c"/>
     <w:p>
       <w:pPr>
         <w:pStyle w:val="Heading3"/>
@@ -13733,8 +14147,8 @@
         </w:tc>
       </w:tr>
     </w:tbl>
-    <w:bookmarkEnd w:id="49"/>
-    <w:bookmarkStart w:id="50" w:name="_01dfdd1b36635418f7f619b6a8fe97afa20d1ad"/>
+    <w:bookmarkEnd w:id="50"/>
+    <w:bookmarkStart w:id="51" w:name="_01dfdd1b36635418f7f619b6a8fe97afa20d1ad"/>
     <w:p>
       <w:pPr>
         <w:pStyle w:val="Heading3"/>
@@ -14135,8 +14549,8 @@
         </w:tc>
       </w:tr>
     </w:tbl>
-    <w:bookmarkEnd w:id="50"/>
-    <w:bookmarkStart w:id="51" w:name="_5998aaf04a74db1bdbece620b37fa8f47c1b962"/>
+    <w:bookmarkEnd w:id="51"/>
+    <w:bookmarkStart w:id="52" w:name="_5998aaf04a74db1bdbece620b37fa8f47c1b962"/>
     <w:p>
       <w:pPr>
         <w:pStyle w:val="Heading3"/>
@@ -14549,8 +14963,8 @@
         </w:tc>
       </w:tr>
     </w:tbl>
-    <w:bookmarkEnd w:id="51"/>
-    <w:bookmarkStart w:id="52" w:name="_c72d089a93eacc68f3ad3e1d08f0618baecc1ac"/>
+    <w:bookmarkEnd w:id="52"/>
+    <w:bookmarkStart w:id="53" w:name="_c72d089a93eacc68f3ad3e1d08f0618baecc1ac"/>
     <w:p>
       <w:pPr>
         <w:pStyle w:val="Heading3"/>
@@ -14951,8 +15365,8 @@
         </w:tc>
       </w:tr>
     </w:tbl>
-    <w:bookmarkEnd w:id="52"/>
-    <w:bookmarkStart w:id="53" w:name="_91b6ffbb178238f5991c4a560d7e3dee9497605"/>
+    <w:bookmarkEnd w:id="53"/>
+    <w:bookmarkStart w:id="54" w:name="_91b6ffbb178238f5991c4a560d7e3dee9497605"/>
     <w:p>
       <w:pPr>
         <w:pStyle w:val="Heading3"/>
@@ -15353,9 +15767,9 @@
         </w:tc>
       </w:tr>
     </w:tbl>
-    <w:bookmarkEnd w:id="53"/>
     <w:bookmarkEnd w:id="54"/>
-    <w:bookmarkStart w:id="59" w:name="_91a444b6a3294a33c007374b53928985fad1328"/>
+    <w:bookmarkEnd w:id="55"/>
+    <w:bookmarkStart w:id="60" w:name="_91a444b6a3294a33c007374b53928985fad1328"/>
     <w:p>
       <w:pPr>
         <w:pStyle w:val="Heading2"/>
@@ -15373,7 +15787,7 @@
         <w:t xml:space="preserve">Domain Lookup</w:t>
       </w:r>
     </w:p>
-    <w:bookmarkStart w:id="55" w:name="_9221a3e174a8efc2e741af37d638d9a216f2a38"/>
+    <w:bookmarkStart w:id="56" w:name="_9221a3e174a8efc2e741af37d638d9a216f2a38"/>
     <w:p>
       <w:pPr>
         <w:pStyle w:val="Heading3"/>
@@ -15780,8 +16194,8 @@
         </w:tc>
       </w:tr>
     </w:tbl>
-    <w:bookmarkEnd w:id="55"/>
-    <w:bookmarkStart w:id="56" w:name="_30b023606457628c6579bc31a3a5dbf1356f4ae"/>
+    <w:bookmarkEnd w:id="56"/>
+    <w:bookmarkStart w:id="57" w:name="_30b023606457628c6579bc31a3a5dbf1356f4ae"/>
     <w:p>
       <w:pPr>
         <w:pStyle w:val="Heading3"/>
@@ -16176,8 +16590,8 @@
         </w:tc>
       </w:tr>
     </w:tbl>
-    <w:bookmarkEnd w:id="56"/>
-    <w:bookmarkStart w:id="57" w:name="_085ea8d5ad326ad051e6c89f75969ae2bca56b7"/>
+    <w:bookmarkEnd w:id="57"/>
+    <w:bookmarkStart w:id="58" w:name="_085ea8d5ad326ad051e6c89f75969ae2bca56b7"/>
     <w:p>
       <w:pPr>
         <w:pStyle w:val="Heading3"/>
@@ -16572,8 +16986,8 @@
         </w:tc>
       </w:tr>
     </w:tbl>
-    <w:bookmarkEnd w:id="57"/>
-    <w:bookmarkStart w:id="58" w:name="_8305dbd39a6cc6dc38a1739a665c8d2d3636272"/>
+    <w:bookmarkEnd w:id="58"/>
+    <w:bookmarkStart w:id="59" w:name="_8305dbd39a6cc6dc38a1739a665c8d2d3636272"/>
     <w:p>
       <w:pPr>
         <w:pStyle w:val="Heading3"/>
@@ -16968,9 +17382,9 @@
         </w:tc>
       </w:tr>
     </w:tbl>
-    <w:bookmarkEnd w:id="58"/>
     <w:bookmarkEnd w:id="59"/>
-    <w:bookmarkStart w:id="63" w:name="_notifications"/>
+    <w:bookmarkEnd w:id="60"/>
+    <w:bookmarkStart w:id="64" w:name="_notifications"/>
     <w:p>
       <w:pPr>
         <w:pStyle w:val="Heading2"/>
@@ -16988,7 +17402,7 @@
         <w:t xml:space="preserve">Notifications</w:t>
       </w:r>
     </w:p>
-    <w:bookmarkStart w:id="60" w:name="_1d9c1c0585af49d82f259a3314f5734f3ad959f"/>
+    <w:bookmarkStart w:id="61" w:name="_1d9c1c0585af49d82f259a3314f5734f3ad959f"/>
     <w:p>
       <w:pPr>
         <w:pStyle w:val="Heading3"/>
@@ -17395,8 +17809,8 @@
         </w:tc>
       </w:tr>
     </w:tbl>
-    <w:bookmarkEnd w:id="60"/>
-    <w:bookmarkStart w:id="61" w:name="_4a08339ec3d0c2f56ea22035d5fed171b89a6c4"/>
+    <w:bookmarkEnd w:id="61"/>
+    <w:bookmarkStart w:id="62" w:name="_4a08339ec3d0c2f56ea22035d5fed171b89a6c4"/>
     <w:p>
       <w:pPr>
         <w:pStyle w:val="Heading3"/>
@@ -17797,8 +18211,8 @@
         </w:tc>
       </w:tr>
     </w:tbl>
-    <w:bookmarkEnd w:id="61"/>
-    <w:bookmarkStart w:id="62" w:name="_042321994b3aa837e06520615e3636bfee87ce2"/>
+    <w:bookmarkEnd w:id="62"/>
+    <w:bookmarkStart w:id="63" w:name="_042321994b3aa837e06520615e3636bfee87ce2"/>
     <w:p>
       <w:pPr>
         <w:pStyle w:val="Heading3"/>
@@ -18199,9 +18613,9 @@
         </w:tc>
       </w:tr>
     </w:tbl>
-    <w:bookmarkEnd w:id="62"/>
     <w:bookmarkEnd w:id="63"/>
-    <w:bookmarkStart w:id="68" w:name="_38a55961392e3eb2c592e6467148e6c37ea6233"/>
+    <w:bookmarkEnd w:id="64"/>
+    <w:bookmarkStart w:id="69" w:name="_38a55961392e3eb2c592e6467148e6c37ea6233"/>
     <w:p>
       <w:pPr>
         <w:pStyle w:val="Heading2"/>
@@ -18219,7 +18633,7 @@
         <w:t xml:space="preserve">DNS Servers</w:t>
       </w:r>
     </w:p>
-    <w:bookmarkStart w:id="64" w:name="_713c1a4af1d43e71c924b35bc35cde9227b899d"/>
+    <w:bookmarkStart w:id="65" w:name="_713c1a4af1d43e71c924b35bc35cde9227b899d"/>
     <w:p>
       <w:pPr>
         <w:pStyle w:val="Heading3"/>
@@ -18614,8 +19028,8 @@
         </w:tc>
       </w:tr>
     </w:tbl>
-    <w:bookmarkEnd w:id="64"/>
-    <w:bookmarkStart w:id="65" w:name="_618929a635e14ce1d7fb8fdde65ab6a1a9806d7"/>
+    <w:bookmarkEnd w:id="65"/>
+    <w:bookmarkStart w:id="66" w:name="_618929a635e14ce1d7fb8fdde65ab6a1a9806d7"/>
     <w:p>
       <w:pPr>
         <w:pStyle w:val="Heading3"/>
@@ -19040,8 +19454,8 @@
         </w:tc>
       </w:tr>
     </w:tbl>
-    <w:bookmarkEnd w:id="65"/>
-    <w:bookmarkStart w:id="66" w:name="_890fc929acb54e00593fdc4f7403fa6c0dfdd91"/>
+    <w:bookmarkEnd w:id="66"/>
+    <w:bookmarkStart w:id="67" w:name="_890fc929acb54e00593fdc4f7403fa6c0dfdd91"/>
     <w:p>
       <w:pPr>
         <w:pStyle w:val="Heading3"/>
@@ -19448,8 +19862,8 @@
         </w:tc>
       </w:tr>
     </w:tbl>
-    <w:bookmarkEnd w:id="66"/>
-    <w:bookmarkStart w:id="67" w:name="_85c933c8305500bb78c829164924916a930510e"/>
+    <w:bookmarkEnd w:id="67"/>
+    <w:bookmarkStart w:id="68" w:name="_85c933c8305500bb78c829164924916a930510e"/>
     <w:p>
       <w:pPr>
         <w:pStyle w:val="Heading3"/>
@@ -19850,9 +20264,9 @@
         </w:tc>
       </w:tr>
     </w:tbl>
-    <w:bookmarkEnd w:id="67"/>
     <w:bookmarkEnd w:id="68"/>
-    <w:bookmarkStart w:id="71" w:name="_047289bb8bc90224dd6cb0601b14266139c4246"/>
+    <w:bookmarkEnd w:id="69"/>
+    <w:bookmarkStart w:id="72" w:name="_047289bb8bc90224dd6cb0601b14266139c4246"/>
     <w:p>
       <w:pPr>
         <w:pStyle w:val="Heading2"/>
@@ -19870,7 +20284,7 @@
         <w:t xml:space="preserve">Legal Citations</w:t>
       </w:r>
     </w:p>
-    <w:bookmarkStart w:id="69" w:name="_d1a7c9f8f6fb66a6cfe5eba996319e82c95fa01"/>
+    <w:bookmarkStart w:id="70" w:name="_d1a7c9f8f6fb66a6cfe5eba996319e82c95fa01"/>
     <w:p>
       <w:pPr>
         <w:pStyle w:val="Heading3"/>
@@ -20283,8 +20697,8 @@
         </w:tc>
       </w:tr>
     </w:tbl>
-    <w:bookmarkEnd w:id="69"/>
-    <w:bookmarkStart w:id="70" w:name="_f6e46545deb5488e60f1fc86588de22b33d49ba"/>
+    <w:bookmarkEnd w:id="70"/>
+    <w:bookmarkStart w:id="71" w:name="_f6e46545deb5488e60f1fc86588de22b33d49ba"/>
     <w:p>
       <w:pPr>
         <w:pStyle w:val="Heading3"/>
@@ -20691,9 +21105,9 @@
         </w:tc>
       </w:tr>
     </w:tbl>
-    <w:bookmarkEnd w:id="70"/>
     <w:bookmarkEnd w:id="71"/>
-    <w:bookmarkStart w:id="75" w:name="_8b59d926c59063469a717ebd513cf4c7edda4bc"/>
+    <w:bookmarkEnd w:id="72"/>
+    <w:bookmarkStart w:id="76" w:name="_8b59d926c59063469a717ebd513cf4c7edda4bc"/>
     <w:p>
       <w:pPr>
         <w:pStyle w:val="Heading2"/>
@@ -20711,7 +21125,7 @@
         <w:t xml:space="preserve">Admin - Users</w:t>
       </w:r>
     </w:p>
-    <w:bookmarkStart w:id="72" w:name="_f478b76430bc19fbda79d80c0261963a911d0d6"/>
+    <w:bookmarkStart w:id="73" w:name="_f478b76430bc19fbda79d80c0261963a911d0d6"/>
     <w:p>
       <w:pPr>
         <w:pStyle w:val="Heading3"/>
@@ -21118,8 +21532,8 @@
         </w:tc>
       </w:tr>
     </w:tbl>
-    <w:bookmarkEnd w:id="72"/>
-    <w:bookmarkStart w:id="73" w:name="_b86130ce8278555c120097ee0d8b59c411b1fbb"/>
+    <w:bookmarkEnd w:id="73"/>
+    <w:bookmarkStart w:id="74" w:name="_b86130ce8278555c120097ee0d8b59c411b1fbb"/>
     <w:p>
       <w:pPr>
         <w:pStyle w:val="Heading3"/>
@@ -21532,8 +21946,8 @@
         </w:tc>
       </w:tr>
     </w:tbl>
-    <w:bookmarkEnd w:id="73"/>
-    <w:bookmarkStart w:id="74" w:name="_3b0b8e14595e575c2e664e46e273de99c6634ec"/>
+    <w:bookmarkEnd w:id="74"/>
+    <w:bookmarkStart w:id="75" w:name="_3b0b8e14595e575c2e664e46e273de99c6634ec"/>
     <w:p>
       <w:pPr>
         <w:pStyle w:val="Heading3"/>
@@ -21928,9 +22342,9 @@
         </w:tc>
       </w:tr>
     </w:tbl>
-    <w:bookmarkEnd w:id="74"/>
     <w:bookmarkEnd w:id="75"/>
-    <w:bookmarkStart w:id="78" w:name="_23f2e0ec86678c3801f7430e636f1fc67d97b2b"/>
+    <w:bookmarkEnd w:id="76"/>
+    <w:bookmarkStart w:id="79" w:name="_23f2e0ec86678c3801f7430e636f1fc67d97b2b"/>
     <w:p>
       <w:pPr>
         <w:pStyle w:val="Heading2"/>
@@ -21948,7 +22362,7 @@
         <w:t xml:space="preserve">Admin - Master Data</w:t>
       </w:r>
     </w:p>
-    <w:bookmarkStart w:id="76" w:name="_1a8b4264fc2a36fd068cdfcf0d9798a6a02680e"/>
+    <w:bookmarkStart w:id="77" w:name="_1a8b4264fc2a36fd068cdfcf0d9798a6a02680e"/>
     <w:p>
       <w:pPr>
         <w:pStyle w:val="Heading3"/>
@@ -22355,8 +22769,8 @@
         </w:tc>
       </w:tr>
     </w:tbl>
-    <w:bookmarkEnd w:id="76"/>
-    <w:bookmarkStart w:id="77" w:name="_48a90fde0b4eb66f61492fd114562f4e89fe6a0"/>
+    <w:bookmarkEnd w:id="77"/>
+    <w:bookmarkStart w:id="78" w:name="_48a90fde0b4eb66f61492fd114562f4e89fe6a0"/>
     <w:p>
       <w:pPr>
         <w:pStyle w:val="Heading3"/>
@@ -22757,9 +23171,9 @@
         </w:tc>
       </w:tr>
     </w:tbl>
-    <w:bookmarkEnd w:id="77"/>
     <w:bookmarkEnd w:id="78"/>
-    <w:bookmarkStart w:id="80" w:name="_f94396428b32702acd425447e6bfbf6b9cc04ec"/>
+    <w:bookmarkEnd w:id="79"/>
+    <w:bookmarkStart w:id="81" w:name="_f94396428b32702acd425447e6bfbf6b9cc04ec"/>
     <w:p>
       <w:pPr>
         <w:pStyle w:val="Heading2"/>
@@ -22777,7 +23191,7 @@
         <w:t xml:space="preserve">Admin - Configs</w:t>
       </w:r>
     </w:p>
-    <w:bookmarkStart w:id="79" w:name="_7d85f98e9b39868f3963b7a5cdc481d32aa61ce"/>
+    <w:bookmarkStart w:id="80" w:name="_7d85f98e9b39868f3963b7a5cdc481d32aa61ce"/>
     <w:p>
       <w:pPr>
         <w:pStyle w:val="Heading3"/>
@@ -23195,10 +23609,10 @@
         <w:br w:type="page"/>
       </w:r>
     </w:p>
-    <w:bookmarkEnd w:id="79"/>
     <w:bookmarkEnd w:id="80"/>
     <w:bookmarkEnd w:id="81"/>
-    <w:bookmarkStart w:id="82" w:name="_dae1f465215414a19944cfedc47ab9b55f579a9"/>
+    <w:bookmarkEnd w:id="82"/>
+    <w:bookmarkStart w:id="83" w:name="_dae1f465215414a19944cfedc47ab9b55f579a9"/>
     <w:p>
       <w:pPr>
         <w:pStyle w:val="Heading1"/>
@@ -24137,8 +24551,8 @@
         </w:tc>
       </w:tr>
     </w:tbl>
-    <w:bookmarkEnd w:id="82"/>
-    <w:bookmarkStart w:id="83" w:name="_640d47fc5bb6780d875a58e07077598817a4f46"/>
+    <w:bookmarkEnd w:id="83"/>
+    <w:bookmarkStart w:id="84" w:name="_640d47fc5bb6780d875a58e07077598817a4f46"/>
     <w:p>
       <w:pPr>
         <w:pStyle w:val="Heading1"/>
@@ -24420,7 +24834,7 @@
         </w:tc>
       </w:tr>
     </w:tbl>
-    <w:bookmarkEnd w:id="83"/>
+    <w:bookmarkEnd w:id="84"/>
     <w:sectPr>
       <w:footerReference r:id="rIdFooter1" w:type="default"/>
       <w:pgSz w:h="16838" w:w="11906"/>

</xml_diff>